<commit_message>
Fix food model, resolve deprecated methods, update project notes
</commit_message>
<xml_diff>
--- a/Програма мій помічник в дієті.docx
+++ b/Програма мій помічник в дієті.docx
@@ -1684,6 +1684,903 @@
           <w:numId w:val="7"/>
         </w:numPr>
       </w:pPr>
+    </w:p>
+    <w:p>
+      <w:pPr>
+        <w:rPr>
+          <w:b/>
+          <w:bCs/>
+        </w:rPr>
+      </w:pPr>
+      <w:r>
+        <w:rPr>
+          <w:b/>
+          <w:bCs/>
+        </w:rPr>
+        <w:t>ЗВІТ ПРО ВИКОНАНІ РОБОТИ ТА ОПТИМІЗАЦІЮ АРХІТЕКТУРИ</w:t>
+      </w:r>
+    </w:p>
+    <w:p>
+      <w:r>
+        <w:rPr>
+          <w:b/>
+          <w:bCs/>
+        </w:rPr>
+        <w:t>Проєкт:</w:t>
+      </w:r>
+      <w:r>
+        <w:t xml:space="preserve"> «Моя дієта» (</w:t>
+      </w:r>
+      <w:proofErr w:type="spellStart"/>
+      <w:r>
+        <w:t>Flutter</w:t>
+      </w:r>
+      <w:proofErr w:type="spellEnd"/>
+      <w:r>
+        <w:t xml:space="preserve"> / </w:t>
+      </w:r>
+      <w:proofErr w:type="spellStart"/>
+      <w:r>
+        <w:t>Dart</w:t>
+      </w:r>
+      <w:proofErr w:type="spellEnd"/>
+      <w:r>
+        <w:t>)</w:t>
+      </w:r>
+    </w:p>
+    <w:p>
+      <w:r>
+        <w:rPr>
+          <w:b/>
+          <w:bCs/>
+        </w:rPr>
+        <w:t>Дата:</w:t>
+      </w:r>
+      <w:r>
+        <w:t xml:space="preserve"> 24 серпня 2026 р.</w:t>
+      </w:r>
+    </w:p>
+    <w:p>
+      <w:pPr>
+        <w:rPr>
+          <w:b/>
+          <w:bCs/>
+        </w:rPr>
+      </w:pPr>
+      <w:r>
+        <w:rPr>
+          <w:b/>
+          <w:bCs/>
+        </w:rPr>
+        <w:t>1. Мета та завдання етапу</w:t>
+      </w:r>
+    </w:p>
+    <w:p>
+      <w:r>
+        <w:t xml:space="preserve">Основною метою цього етапу розробки було усунення критичних розбіжностей у моделях даних, оптимізація </w:t>
+      </w:r>
+      <w:proofErr w:type="spellStart"/>
+      <w:r>
+        <w:t>імпортів</w:t>
+      </w:r>
+      <w:proofErr w:type="spellEnd"/>
+      <w:r>
+        <w:t xml:space="preserve">, міграція застарілих методів </w:t>
+      </w:r>
+      <w:proofErr w:type="spellStart"/>
+      <w:r>
+        <w:t>Flutter</w:t>
+      </w:r>
+      <w:proofErr w:type="spellEnd"/>
+      <w:r>
+        <w:t xml:space="preserve"> SDK на актуальні стандарти та аналіз алгоритмів розрахунку нутрієнтів.</w:t>
+      </w:r>
+    </w:p>
+    <w:p>
+      <w:pPr>
+        <w:rPr>
+          <w:b/>
+          <w:bCs/>
+        </w:rPr>
+      </w:pPr>
+      <w:r>
+        <w:rPr>
+          <w:b/>
+          <w:bCs/>
+        </w:rPr>
+        <w:t>2. Ключові досягнення та технічні зміни</w:t>
+      </w:r>
+    </w:p>
+    <w:p>
+      <w:pPr>
+        <w:numPr>
+          <w:ilvl w:val="0"/>
+          <w:numId w:val="9"/>
+        </w:numPr>
+      </w:pPr>
+      <w:r>
+        <w:rPr>
+          <w:b/>
+          <w:bCs/>
+        </w:rPr>
+        <w:t>Стандартизація та уніфікація моделі продуктів (</w:t>
+      </w:r>
+      <w:proofErr w:type="spellStart"/>
+      <w:r>
+        <w:rPr>
+          <w:b/>
+          <w:bCs/>
+        </w:rPr>
+        <w:t>FoodItemModel</w:t>
+      </w:r>
+      <w:proofErr w:type="spellEnd"/>
+      <w:r>
+        <w:rPr>
+          <w:b/>
+          <w:bCs/>
+        </w:rPr>
+        <w:t>)</w:t>
+      </w:r>
+    </w:p>
+    <w:p>
+      <w:pPr>
+        <w:numPr>
+          <w:ilvl w:val="1"/>
+          <w:numId w:val="9"/>
+        </w:numPr>
+      </w:pPr>
+      <w:r>
+        <w:t xml:space="preserve">Проведено повне узгодження назв класів і файлів. Прийнято єдину концепцію найменування </w:t>
+      </w:r>
+      <w:proofErr w:type="spellStart"/>
+      <w:r>
+        <w:t>FoodItemModel</w:t>
+      </w:r>
+      <w:proofErr w:type="spellEnd"/>
+      <w:r>
+        <w:t xml:space="preserve"> у файлі </w:t>
+      </w:r>
+      <w:proofErr w:type="spellStart"/>
+      <w:r>
+        <w:t>lib</w:t>
+      </w:r>
+      <w:proofErr w:type="spellEnd"/>
+      <w:r>
+        <w:t>/</w:t>
+      </w:r>
+      <w:proofErr w:type="spellStart"/>
+      <w:r>
+        <w:t>models</w:t>
+      </w:r>
+      <w:proofErr w:type="spellEnd"/>
+      <w:r>
+        <w:t>/</w:t>
+      </w:r>
+      <w:proofErr w:type="spellStart"/>
+      <w:r>
+        <w:t>food_item_model.dart</w:t>
+      </w:r>
+      <w:proofErr w:type="spellEnd"/>
+      <w:r>
+        <w:t>.</w:t>
+      </w:r>
+    </w:p>
+    <w:p>
+      <w:pPr>
+        <w:numPr>
+          <w:ilvl w:val="1"/>
+          <w:numId w:val="9"/>
+        </w:numPr>
+      </w:pPr>
+      <w:r>
+        <w:t xml:space="preserve">Модель розширено обов'язковими та додатковими полями: </w:t>
+      </w:r>
+      <w:proofErr w:type="spellStart"/>
+      <w:r>
+        <w:t>id</w:t>
+      </w:r>
+      <w:proofErr w:type="spellEnd"/>
+      <w:r>
+        <w:t xml:space="preserve">, </w:t>
+      </w:r>
+      <w:proofErr w:type="spellStart"/>
+      <w:r>
+        <w:t>name</w:t>
+      </w:r>
+      <w:proofErr w:type="spellEnd"/>
+      <w:r>
+        <w:t xml:space="preserve">, </w:t>
+      </w:r>
+      <w:proofErr w:type="spellStart"/>
+      <w:r>
+        <w:t>category</w:t>
+      </w:r>
+      <w:proofErr w:type="spellEnd"/>
+      <w:r>
+        <w:t xml:space="preserve">, </w:t>
+      </w:r>
+      <w:proofErr w:type="spellStart"/>
+      <w:r>
+        <w:t>manufacturer</w:t>
+      </w:r>
+      <w:proofErr w:type="spellEnd"/>
+      <w:r>
+        <w:t xml:space="preserve">, </w:t>
+      </w:r>
+      <w:proofErr w:type="spellStart"/>
+      <w:r>
+        <w:t>weight</w:t>
+      </w:r>
+      <w:proofErr w:type="spellEnd"/>
+      <w:r>
+        <w:t xml:space="preserve">, </w:t>
+      </w:r>
+      <w:proofErr w:type="spellStart"/>
+      <w:r>
+        <w:t>phe</w:t>
+      </w:r>
+      <w:proofErr w:type="spellEnd"/>
+      <w:r>
+        <w:t xml:space="preserve">, </w:t>
+      </w:r>
+      <w:proofErr w:type="spellStart"/>
+      <w:r>
+        <w:t>calories</w:t>
+      </w:r>
+      <w:proofErr w:type="spellEnd"/>
+      <w:r>
+        <w:t xml:space="preserve">, </w:t>
+      </w:r>
+      <w:proofErr w:type="spellStart"/>
+      <w:r>
+        <w:t>protein</w:t>
+      </w:r>
+      <w:proofErr w:type="spellEnd"/>
+      <w:r>
+        <w:t xml:space="preserve">, </w:t>
+      </w:r>
+      <w:proofErr w:type="spellStart"/>
+      <w:r>
+        <w:t>carbs</w:t>
+      </w:r>
+      <w:proofErr w:type="spellEnd"/>
+      <w:r>
+        <w:t xml:space="preserve">, </w:t>
+      </w:r>
+      <w:proofErr w:type="spellStart"/>
+      <w:r>
+        <w:t>fat</w:t>
+      </w:r>
+      <w:proofErr w:type="spellEnd"/>
+      <w:r>
+        <w:t>.</w:t>
+      </w:r>
+    </w:p>
+    <w:p>
+      <w:pPr>
+        <w:numPr>
+          <w:ilvl w:val="1"/>
+          <w:numId w:val="9"/>
+        </w:numPr>
+      </w:pPr>
+      <w:r>
+        <w:t xml:space="preserve">Додано фабричний конструктор </w:t>
+      </w:r>
+      <w:proofErr w:type="spellStart"/>
+      <w:r>
+        <w:t>FoodItemModel.fromJson</w:t>
+      </w:r>
+      <w:proofErr w:type="spellEnd"/>
+      <w:r>
+        <w:t xml:space="preserve">() та метод </w:t>
+      </w:r>
+      <w:proofErr w:type="spellStart"/>
+      <w:r>
+        <w:t>toJson</w:t>
+      </w:r>
+      <w:proofErr w:type="spellEnd"/>
+      <w:r>
+        <w:t>() для забезпечення коректної серіалізації/</w:t>
+      </w:r>
+      <w:proofErr w:type="spellStart"/>
+      <w:r>
+        <w:t>десеріалізації</w:t>
+      </w:r>
+      <w:proofErr w:type="spellEnd"/>
+      <w:r>
+        <w:t xml:space="preserve"> даних при роботі з локальною </w:t>
+      </w:r>
+      <w:proofErr w:type="spellStart"/>
+      <w:r>
+        <w:t>базой</w:t>
+      </w:r>
+      <w:proofErr w:type="spellEnd"/>
+      <w:r>
+        <w:t xml:space="preserve"> даних або мережевими запитами.</w:t>
+      </w:r>
+    </w:p>
+    <w:p>
+      <w:pPr>
+        <w:numPr>
+          <w:ilvl w:val="1"/>
+          <w:numId w:val="9"/>
+        </w:numPr>
+      </w:pPr>
+      <w:r>
+        <w:t>Збережено шаблон незмінності (</w:t>
+      </w:r>
+      <w:proofErr w:type="spellStart"/>
+      <w:r>
+        <w:t>Immutable</w:t>
+      </w:r>
+      <w:proofErr w:type="spellEnd"/>
+      <w:r>
+        <w:t xml:space="preserve"> </w:t>
+      </w:r>
+      <w:proofErr w:type="spellStart"/>
+      <w:r>
+        <w:t>pattern</w:t>
+      </w:r>
+      <w:proofErr w:type="spellEnd"/>
+      <w:r>
+        <w:t xml:space="preserve">) за допомогою </w:t>
+      </w:r>
+      <w:proofErr w:type="spellStart"/>
+      <w:r>
+        <w:t>final</w:t>
+      </w:r>
+      <w:proofErr w:type="spellEnd"/>
+      <w:r>
+        <w:t xml:space="preserve">-полів та розширено метод </w:t>
+      </w:r>
+      <w:proofErr w:type="spellStart"/>
+      <w:r>
+        <w:t>copyWith</w:t>
+      </w:r>
+      <w:proofErr w:type="spellEnd"/>
+      <w:r>
+        <w:t>() для безпечного редагування окремих атрибутів продукту.</w:t>
+      </w:r>
+    </w:p>
+    <w:p>
+      <w:pPr>
+        <w:numPr>
+          <w:ilvl w:val="0"/>
+          <w:numId w:val="9"/>
+        </w:numPr>
+      </w:pPr>
+      <w:proofErr w:type="spellStart"/>
+      <w:r>
+        <w:rPr>
+          <w:b/>
+          <w:bCs/>
+        </w:rPr>
+        <w:t>Рефакторинг</w:t>
+      </w:r>
+      <w:proofErr w:type="spellEnd"/>
+      <w:r>
+        <w:rPr>
+          <w:b/>
+          <w:bCs/>
+        </w:rPr>
+        <w:t xml:space="preserve"> репозиторію та сервісів (</w:t>
+      </w:r>
+      <w:proofErr w:type="spellStart"/>
+      <w:r>
+        <w:rPr>
+          <w:b/>
+          <w:bCs/>
+        </w:rPr>
+        <w:t>FoodRepository</w:t>
+      </w:r>
+      <w:proofErr w:type="spellEnd"/>
+      <w:r>
+        <w:rPr>
+          <w:b/>
+          <w:bCs/>
+        </w:rPr>
+        <w:t xml:space="preserve">, </w:t>
+      </w:r>
+      <w:proofErr w:type="spellStart"/>
+      <w:r>
+        <w:rPr>
+          <w:b/>
+          <w:bCs/>
+        </w:rPr>
+        <w:t>DietSettingsService</w:t>
+      </w:r>
+      <w:proofErr w:type="spellEnd"/>
+      <w:r>
+        <w:rPr>
+          <w:b/>
+          <w:bCs/>
+        </w:rPr>
+        <w:t>)</w:t>
+      </w:r>
+    </w:p>
+    <w:p>
+      <w:pPr>
+        <w:numPr>
+          <w:ilvl w:val="1"/>
+          <w:numId w:val="9"/>
+        </w:numPr>
+      </w:pPr>
+      <w:r>
+        <w:t xml:space="preserve">Виправлено помилки типу </w:t>
+      </w:r>
+      <w:proofErr w:type="spellStart"/>
+      <w:r>
+        <w:t>The</w:t>
+      </w:r>
+      <w:proofErr w:type="spellEnd"/>
+      <w:r>
+        <w:t xml:space="preserve"> </w:t>
+      </w:r>
+      <w:proofErr w:type="spellStart"/>
+      <w:r>
+        <w:t>name</w:t>
+      </w:r>
+      <w:proofErr w:type="spellEnd"/>
+      <w:r>
+        <w:t xml:space="preserve"> '</w:t>
+      </w:r>
+      <w:proofErr w:type="spellStart"/>
+      <w:r>
+        <w:t>FoodItem</w:t>
+      </w:r>
+      <w:proofErr w:type="spellEnd"/>
+      <w:r>
+        <w:t xml:space="preserve">' </w:t>
+      </w:r>
+      <w:proofErr w:type="spellStart"/>
+      <w:r>
+        <w:t>isn't</w:t>
+      </w:r>
+      <w:proofErr w:type="spellEnd"/>
+      <w:r>
+        <w:t xml:space="preserve"> a </w:t>
+      </w:r>
+      <w:proofErr w:type="spellStart"/>
+      <w:r>
+        <w:t>type</w:t>
+      </w:r>
+      <w:proofErr w:type="spellEnd"/>
+      <w:r>
+        <w:t>, які виникали через розбіжність у найменуванні класів.</w:t>
+      </w:r>
+    </w:p>
+    <w:p>
+      <w:pPr>
+        <w:numPr>
+          <w:ilvl w:val="1"/>
+          <w:numId w:val="9"/>
+        </w:numPr>
+      </w:pPr>
+      <w:proofErr w:type="spellStart"/>
+      <w:r>
+        <w:t>Усунено</w:t>
+      </w:r>
+      <w:proofErr w:type="spellEnd"/>
+      <w:r>
+        <w:t xml:space="preserve"> невикористовувані </w:t>
+      </w:r>
+      <w:proofErr w:type="spellStart"/>
+      <w:r>
+        <w:t>імпорти</w:t>
+      </w:r>
+      <w:proofErr w:type="spellEnd"/>
+      <w:r>
+        <w:t xml:space="preserve"> (зокрема </w:t>
+      </w:r>
+      <w:proofErr w:type="spellStart"/>
+      <w:r>
+        <w:t>package:flutter</w:t>
+      </w:r>
+      <w:proofErr w:type="spellEnd"/>
+      <w:r>
+        <w:t>/</w:t>
+      </w:r>
+      <w:proofErr w:type="spellStart"/>
+      <w:r>
+        <w:t>material.dart</w:t>
+      </w:r>
+      <w:proofErr w:type="spellEnd"/>
+      <w:r>
+        <w:t xml:space="preserve"> у чистому сервісі </w:t>
+      </w:r>
+      <w:proofErr w:type="spellStart"/>
+      <w:r>
+        <w:t>DietSettingsService</w:t>
+      </w:r>
+      <w:proofErr w:type="spellEnd"/>
+      <w:r>
+        <w:t>), що дозволило зменшити зв'язаність коду та покращити його підтримку.</w:t>
+      </w:r>
+    </w:p>
+    <w:p>
+      <w:pPr>
+        <w:numPr>
+          <w:ilvl w:val="0"/>
+          <w:numId w:val="9"/>
+        </w:numPr>
+      </w:pPr>
+      <w:r>
+        <w:rPr>
+          <w:b/>
+          <w:bCs/>
+        </w:rPr>
+        <w:t xml:space="preserve">Міграція на актуальні API </w:t>
+      </w:r>
+      <w:proofErr w:type="spellStart"/>
+      <w:r>
+        <w:rPr>
+          <w:b/>
+          <w:bCs/>
+        </w:rPr>
+        <w:t>Flutter</w:t>
+      </w:r>
+      <w:proofErr w:type="spellEnd"/>
+      <w:r>
+        <w:rPr>
+          <w:b/>
+          <w:bCs/>
+        </w:rPr>
+        <w:t xml:space="preserve"> SDK</w:t>
+      </w:r>
+    </w:p>
+    <w:p>
+      <w:pPr>
+        <w:numPr>
+          <w:ilvl w:val="1"/>
+          <w:numId w:val="9"/>
+        </w:numPr>
+      </w:pPr>
+      <w:r>
+        <w:t xml:space="preserve">У файлі </w:t>
+      </w:r>
+      <w:proofErr w:type="spellStart"/>
+      <w:r>
+        <w:t>food_details_screen.dart</w:t>
+      </w:r>
+      <w:proofErr w:type="spellEnd"/>
+      <w:r>
+        <w:t xml:space="preserve"> </w:t>
+      </w:r>
+      <w:proofErr w:type="spellStart"/>
+      <w:r>
+        <w:t>усунено</w:t>
+      </w:r>
+      <w:proofErr w:type="spellEnd"/>
+      <w:r>
+        <w:t xml:space="preserve"> використання застарілого </w:t>
+      </w:r>
+      <w:proofErr w:type="spellStart"/>
+      <w:r>
+        <w:t>калбеку</w:t>
+      </w:r>
+      <w:proofErr w:type="spellEnd"/>
+      <w:r>
+        <w:t xml:space="preserve"> </w:t>
+      </w:r>
+      <w:proofErr w:type="spellStart"/>
+      <w:r>
+        <w:t>onReorder</w:t>
+      </w:r>
+      <w:proofErr w:type="spellEnd"/>
+      <w:r>
+        <w:t>, який викликав попередження синтаксичного аналізатора (</w:t>
+      </w:r>
+      <w:proofErr w:type="spellStart"/>
+      <w:r>
+        <w:t>deprecated</w:t>
+      </w:r>
+      <w:proofErr w:type="spellEnd"/>
+      <w:r>
+        <w:t>).</w:t>
+      </w:r>
+    </w:p>
+    <w:p>
+      <w:pPr>
+        <w:numPr>
+          <w:ilvl w:val="1"/>
+          <w:numId w:val="9"/>
+        </w:numPr>
+      </w:pPr>
+      <w:r>
+        <w:t xml:space="preserve">Здійснено перехід на сучасний </w:t>
+      </w:r>
+      <w:proofErr w:type="spellStart"/>
+      <w:r>
+        <w:t>калбек</w:t>
+      </w:r>
+      <w:proofErr w:type="spellEnd"/>
+      <w:r>
+        <w:t xml:space="preserve"> </w:t>
+      </w:r>
+      <w:proofErr w:type="spellStart"/>
+      <w:r>
+        <w:t>onReorderItem</w:t>
+      </w:r>
+      <w:proofErr w:type="spellEnd"/>
+      <w:r>
+        <w:t>. Це спростило логіку перетягування елементів списку, оскільки нове API автоматично коригує зміщення індексів (</w:t>
+      </w:r>
+      <w:proofErr w:type="spellStart"/>
+      <w:r>
+        <w:t>newIndex</w:t>
+      </w:r>
+      <w:proofErr w:type="spellEnd"/>
+      <w:r>
+        <w:t xml:space="preserve">) без необхідності використання ручного костиля </w:t>
+      </w:r>
+      <w:proofErr w:type="spellStart"/>
+      <w:r>
+        <w:t>if</w:t>
+      </w:r>
+      <w:proofErr w:type="spellEnd"/>
+      <w:r>
+        <w:t xml:space="preserve"> (</w:t>
+      </w:r>
+      <w:proofErr w:type="spellStart"/>
+      <w:r>
+        <w:t>newIndex</w:t>
+      </w:r>
+      <w:proofErr w:type="spellEnd"/>
+      <w:r>
+        <w:t xml:space="preserve"> &gt; </w:t>
+      </w:r>
+      <w:proofErr w:type="spellStart"/>
+      <w:r>
+        <w:t>oldIndex</w:t>
+      </w:r>
+      <w:proofErr w:type="spellEnd"/>
+      <w:r>
+        <w:t xml:space="preserve">) </w:t>
+      </w:r>
+      <w:proofErr w:type="spellStart"/>
+      <w:r>
+        <w:t>newIndex</w:t>
+      </w:r>
+      <w:proofErr w:type="spellEnd"/>
+      <w:r>
+        <w:t xml:space="preserve"> -= 1;.</w:t>
+      </w:r>
+    </w:p>
+    <w:p>
+      <w:pPr>
+        <w:numPr>
+          <w:ilvl w:val="0"/>
+          <w:numId w:val="9"/>
+        </w:numPr>
+      </w:pPr>
+      <w:r>
+        <w:rPr>
+          <w:b/>
+          <w:bCs/>
+        </w:rPr>
+        <w:lastRenderedPageBreak/>
+        <w:t>Аналіз логіки обчислення амінокислот (</w:t>
+      </w:r>
+      <w:proofErr w:type="spellStart"/>
+      <w:r>
+        <w:rPr>
+          <w:b/>
+          <w:bCs/>
+        </w:rPr>
+        <w:t>Leu</w:t>
+      </w:r>
+      <w:proofErr w:type="spellEnd"/>
+      <w:r>
+        <w:rPr>
+          <w:b/>
+          <w:bCs/>
+        </w:rPr>
+        <w:t xml:space="preserve">, </w:t>
+      </w:r>
+      <w:proofErr w:type="spellStart"/>
+      <w:r>
+        <w:rPr>
+          <w:b/>
+          <w:bCs/>
+        </w:rPr>
+        <w:t>Tyr</w:t>
+      </w:r>
+      <w:proofErr w:type="spellEnd"/>
+      <w:r>
+        <w:rPr>
+          <w:b/>
+          <w:bCs/>
+        </w:rPr>
+        <w:t xml:space="preserve">, </w:t>
+      </w:r>
+      <w:proofErr w:type="spellStart"/>
+      <w:r>
+        <w:rPr>
+          <w:b/>
+          <w:bCs/>
+        </w:rPr>
+        <w:t>Met</w:t>
+      </w:r>
+      <w:proofErr w:type="spellEnd"/>
+      <w:r>
+        <w:rPr>
+          <w:b/>
+          <w:bCs/>
+        </w:rPr>
+        <w:t xml:space="preserve">, </w:t>
+      </w:r>
+      <w:proofErr w:type="spellStart"/>
+      <w:r>
+        <w:rPr>
+          <w:b/>
+          <w:bCs/>
+        </w:rPr>
+        <w:t>Les</w:t>
+      </w:r>
+      <w:proofErr w:type="spellEnd"/>
+      <w:r>
+        <w:rPr>
+          <w:b/>
+          <w:bCs/>
+        </w:rPr>
+        <w:t>)</w:t>
+      </w:r>
+    </w:p>
+    <w:p>
+      <w:pPr>
+        <w:numPr>
+          <w:ilvl w:val="1"/>
+          <w:numId w:val="9"/>
+        </w:numPr>
+      </w:pPr>
+      <w:r>
+        <w:t>Проведено діагностику механізму розрахунку допоміжних амінокислот (лейцину, тирозину, метіоніну та лізину) у згорнутій картці фенілаланіну.</w:t>
+      </w:r>
+    </w:p>
+    <w:p>
+      <w:pPr>
+        <w:numPr>
+          <w:ilvl w:val="1"/>
+          <w:numId w:val="9"/>
+        </w:numPr>
+      </w:pPr>
+      <w:r>
+        <w:t>З'ясовано причинно-наслідковий зв'язок між динамічним введенням ФА та відображенням пропорційних значень амінокислот. Підготовлено підґрунтя для винесення цих формул у прозорі налаштування користувача.</w:t>
+      </w:r>
+    </w:p>
+    <w:p>
+      <w:pPr>
+        <w:rPr>
+          <w:b/>
+          <w:bCs/>
+        </w:rPr>
+      </w:pPr>
+      <w:r>
+        <w:rPr>
+          <w:b/>
+          <w:bCs/>
+        </w:rPr>
+        <w:t>3. Результат та поточний стан проєкту</w:t>
+      </w:r>
+    </w:p>
+    <w:p>
+      <w:pPr>
+        <w:numPr>
+          <w:ilvl w:val="0"/>
+          <w:numId w:val="10"/>
+        </w:numPr>
+      </w:pPr>
+      <w:r>
+        <w:rPr>
+          <w:b/>
+          <w:bCs/>
+        </w:rPr>
+        <w:t>Стабільність збірки:</w:t>
+      </w:r>
+      <w:r>
+        <w:t xml:space="preserve"> </w:t>
+      </w:r>
+      <w:proofErr w:type="spellStart"/>
+      <w:r>
+        <w:t>Усунено</w:t>
+      </w:r>
+      <w:proofErr w:type="spellEnd"/>
+      <w:r>
+        <w:t xml:space="preserve"> всі помилки компіляції (</w:t>
+      </w:r>
+      <w:proofErr w:type="spellStart"/>
+      <w:r>
+        <w:t>Errors</w:t>
+      </w:r>
+      <w:proofErr w:type="spellEnd"/>
+      <w:r>
+        <w:t>) та попередження компілятора (</w:t>
+      </w:r>
+      <w:proofErr w:type="spellStart"/>
+      <w:r>
+        <w:t>Warnings</w:t>
+      </w:r>
+      <w:proofErr w:type="spellEnd"/>
+      <w:r>
+        <w:t>/</w:t>
+      </w:r>
+      <w:proofErr w:type="spellStart"/>
+      <w:r>
+        <w:t>Deprecated</w:t>
+      </w:r>
+      <w:proofErr w:type="spellEnd"/>
+      <w:r>
+        <w:t>).</w:t>
+      </w:r>
+    </w:p>
+    <w:p>
+      <w:pPr>
+        <w:numPr>
+          <w:ilvl w:val="0"/>
+          <w:numId w:val="10"/>
+        </w:numPr>
+      </w:pPr>
+      <w:r>
+        <w:rPr>
+          <w:b/>
+          <w:bCs/>
+        </w:rPr>
+        <w:t>Чистота коду:</w:t>
+      </w:r>
+      <w:r>
+        <w:t xml:space="preserve"> Проєкт повністю </w:t>
+      </w:r>
+      <w:proofErr w:type="spellStart"/>
+      <w:r>
+        <w:t>готов</w:t>
+      </w:r>
+      <w:proofErr w:type="spellEnd"/>
+      <w:r>
+        <w:t xml:space="preserve"> до подальшого структурування та документації.</w:t>
+      </w:r>
+    </w:p>
+    <w:p>
+      <w:pPr>
+        <w:numPr>
+          <w:ilvl w:val="0"/>
+          <w:numId w:val="10"/>
+        </w:numPr>
+      </w:pPr>
+      <w:proofErr w:type="spellStart"/>
+      <w:r>
+        <w:rPr>
+          <w:b/>
+          <w:bCs/>
+        </w:rPr>
+        <w:t>Версійність</w:t>
+      </w:r>
+      <w:proofErr w:type="spellEnd"/>
+      <w:r>
+        <w:rPr>
+          <w:b/>
+          <w:bCs/>
+        </w:rPr>
+        <w:t>:</w:t>
+      </w:r>
+      <w:r>
+        <w:t xml:space="preserve"> Усі зміни успішно зафіксовані в локальному репозиторії </w:t>
+      </w:r>
+      <w:proofErr w:type="spellStart"/>
+      <w:r>
+        <w:t>Git</w:t>
+      </w:r>
+      <w:proofErr w:type="spellEnd"/>
+      <w:r>
+        <w:t xml:space="preserve"> та відправлені у віддалений репозиторій на </w:t>
+      </w:r>
+      <w:proofErr w:type="spellStart"/>
+      <w:r>
+        <w:t>GitHub</w:t>
+      </w:r>
+      <w:proofErr w:type="spellEnd"/>
+      <w:r>
+        <w:t>.</w:t>
+      </w:r>
     </w:p>
     <w:p/>
     <w:sectPr>
@@ -2521,6 +3418,304 @@
     </w:lvl>
   </w:abstractNum>
   <w:abstractNum w:abstractNumId="6" w15:restartNumberingAfterBreak="0">
+    <w:nsid w:val="4AA84507"/>
+    <w:multiLevelType w:val="multilevel"/>
+    <w:tmpl w:val="B34E2D7A"/>
+    <w:lvl w:ilvl="0">
+      <w:start w:val="1"/>
+      <w:numFmt w:val="bullet"/>
+      <w:lvlText w:val=""/>
+      <w:lvlJc w:val="left"/>
+      <w:pPr>
+        <w:tabs>
+          <w:tab w:val="num" w:pos="720"/>
+        </w:tabs>
+        <w:ind w:left="720" w:hanging="360"/>
+      </w:pPr>
+      <w:rPr>
+        <w:rFonts w:ascii="Symbol" w:hAnsi="Symbol" w:hint="default"/>
+        <w:sz w:val="20"/>
+      </w:rPr>
+    </w:lvl>
+    <w:lvl w:ilvl="1" w:tentative="1">
+      <w:start w:val="1"/>
+      <w:numFmt w:val="bullet"/>
+      <w:lvlText w:val="o"/>
+      <w:lvlJc w:val="left"/>
+      <w:pPr>
+        <w:tabs>
+          <w:tab w:val="num" w:pos="1440"/>
+        </w:tabs>
+        <w:ind w:left="1440" w:hanging="360"/>
+      </w:pPr>
+      <w:rPr>
+        <w:rFonts w:ascii="Courier New" w:hAnsi="Courier New" w:hint="default"/>
+        <w:sz w:val="20"/>
+      </w:rPr>
+    </w:lvl>
+    <w:lvl w:ilvl="2" w:tentative="1">
+      <w:start w:val="1"/>
+      <w:numFmt w:val="bullet"/>
+      <w:lvlText w:val=""/>
+      <w:lvlJc w:val="left"/>
+      <w:pPr>
+        <w:tabs>
+          <w:tab w:val="num" w:pos="2160"/>
+        </w:tabs>
+        <w:ind w:left="2160" w:hanging="360"/>
+      </w:pPr>
+      <w:rPr>
+        <w:rFonts w:ascii="Wingdings" w:hAnsi="Wingdings" w:hint="default"/>
+        <w:sz w:val="20"/>
+      </w:rPr>
+    </w:lvl>
+    <w:lvl w:ilvl="3" w:tentative="1">
+      <w:start w:val="1"/>
+      <w:numFmt w:val="bullet"/>
+      <w:lvlText w:val=""/>
+      <w:lvlJc w:val="left"/>
+      <w:pPr>
+        <w:tabs>
+          <w:tab w:val="num" w:pos="2880"/>
+        </w:tabs>
+        <w:ind w:left="2880" w:hanging="360"/>
+      </w:pPr>
+      <w:rPr>
+        <w:rFonts w:ascii="Wingdings" w:hAnsi="Wingdings" w:hint="default"/>
+        <w:sz w:val="20"/>
+      </w:rPr>
+    </w:lvl>
+    <w:lvl w:ilvl="4" w:tentative="1">
+      <w:start w:val="1"/>
+      <w:numFmt w:val="bullet"/>
+      <w:lvlText w:val=""/>
+      <w:lvlJc w:val="left"/>
+      <w:pPr>
+        <w:tabs>
+          <w:tab w:val="num" w:pos="3600"/>
+        </w:tabs>
+        <w:ind w:left="3600" w:hanging="360"/>
+      </w:pPr>
+      <w:rPr>
+        <w:rFonts w:ascii="Wingdings" w:hAnsi="Wingdings" w:hint="default"/>
+        <w:sz w:val="20"/>
+      </w:rPr>
+    </w:lvl>
+    <w:lvl w:ilvl="5" w:tentative="1">
+      <w:start w:val="1"/>
+      <w:numFmt w:val="bullet"/>
+      <w:lvlText w:val=""/>
+      <w:lvlJc w:val="left"/>
+      <w:pPr>
+        <w:tabs>
+          <w:tab w:val="num" w:pos="4320"/>
+        </w:tabs>
+        <w:ind w:left="4320" w:hanging="360"/>
+      </w:pPr>
+      <w:rPr>
+        <w:rFonts w:ascii="Wingdings" w:hAnsi="Wingdings" w:hint="default"/>
+        <w:sz w:val="20"/>
+      </w:rPr>
+    </w:lvl>
+    <w:lvl w:ilvl="6" w:tentative="1">
+      <w:start w:val="1"/>
+      <w:numFmt w:val="bullet"/>
+      <w:lvlText w:val=""/>
+      <w:lvlJc w:val="left"/>
+      <w:pPr>
+        <w:tabs>
+          <w:tab w:val="num" w:pos="5040"/>
+        </w:tabs>
+        <w:ind w:left="5040" w:hanging="360"/>
+      </w:pPr>
+      <w:rPr>
+        <w:rFonts w:ascii="Wingdings" w:hAnsi="Wingdings" w:hint="default"/>
+        <w:sz w:val="20"/>
+      </w:rPr>
+    </w:lvl>
+    <w:lvl w:ilvl="7" w:tentative="1">
+      <w:start w:val="1"/>
+      <w:numFmt w:val="bullet"/>
+      <w:lvlText w:val=""/>
+      <w:lvlJc w:val="left"/>
+      <w:pPr>
+        <w:tabs>
+          <w:tab w:val="num" w:pos="5760"/>
+        </w:tabs>
+        <w:ind w:left="5760" w:hanging="360"/>
+      </w:pPr>
+      <w:rPr>
+        <w:rFonts w:ascii="Wingdings" w:hAnsi="Wingdings" w:hint="default"/>
+        <w:sz w:val="20"/>
+      </w:rPr>
+    </w:lvl>
+    <w:lvl w:ilvl="8" w:tentative="1">
+      <w:start w:val="1"/>
+      <w:numFmt w:val="bullet"/>
+      <w:lvlText w:val=""/>
+      <w:lvlJc w:val="left"/>
+      <w:pPr>
+        <w:tabs>
+          <w:tab w:val="num" w:pos="6480"/>
+        </w:tabs>
+        <w:ind w:left="6480" w:hanging="360"/>
+      </w:pPr>
+      <w:rPr>
+        <w:rFonts w:ascii="Wingdings" w:hAnsi="Wingdings" w:hint="default"/>
+        <w:sz w:val="20"/>
+      </w:rPr>
+    </w:lvl>
+  </w:abstractNum>
+  <w:abstractNum w:abstractNumId="7" w15:restartNumberingAfterBreak="0">
+    <w:nsid w:val="4C2D2D81"/>
+    <w:multiLevelType w:val="multilevel"/>
+    <w:tmpl w:val="B4B27EFA"/>
+    <w:lvl w:ilvl="0">
+      <w:start w:val="1"/>
+      <w:numFmt w:val="bullet"/>
+      <w:lvlText w:val=""/>
+      <w:lvlJc w:val="left"/>
+      <w:pPr>
+        <w:tabs>
+          <w:tab w:val="num" w:pos="720"/>
+        </w:tabs>
+        <w:ind w:left="720" w:hanging="360"/>
+      </w:pPr>
+      <w:rPr>
+        <w:rFonts w:ascii="Symbol" w:hAnsi="Symbol" w:hint="default"/>
+        <w:sz w:val="20"/>
+      </w:rPr>
+    </w:lvl>
+    <w:lvl w:ilvl="1">
+      <w:start w:val="1"/>
+      <w:numFmt w:val="bullet"/>
+      <w:lvlText w:val="o"/>
+      <w:lvlJc w:val="left"/>
+      <w:pPr>
+        <w:tabs>
+          <w:tab w:val="num" w:pos="1440"/>
+        </w:tabs>
+        <w:ind w:left="1440" w:hanging="360"/>
+      </w:pPr>
+      <w:rPr>
+        <w:rFonts w:ascii="Courier New" w:hAnsi="Courier New" w:hint="default"/>
+        <w:sz w:val="20"/>
+      </w:rPr>
+    </w:lvl>
+    <w:lvl w:ilvl="2" w:tentative="1">
+      <w:start w:val="1"/>
+      <w:numFmt w:val="bullet"/>
+      <w:lvlText w:val=""/>
+      <w:lvlJc w:val="left"/>
+      <w:pPr>
+        <w:tabs>
+          <w:tab w:val="num" w:pos="2160"/>
+        </w:tabs>
+        <w:ind w:left="2160" w:hanging="360"/>
+      </w:pPr>
+      <w:rPr>
+        <w:rFonts w:ascii="Wingdings" w:hAnsi="Wingdings" w:hint="default"/>
+        <w:sz w:val="20"/>
+      </w:rPr>
+    </w:lvl>
+    <w:lvl w:ilvl="3" w:tentative="1">
+      <w:start w:val="1"/>
+      <w:numFmt w:val="bullet"/>
+      <w:lvlText w:val=""/>
+      <w:lvlJc w:val="left"/>
+      <w:pPr>
+        <w:tabs>
+          <w:tab w:val="num" w:pos="2880"/>
+        </w:tabs>
+        <w:ind w:left="2880" w:hanging="360"/>
+      </w:pPr>
+      <w:rPr>
+        <w:rFonts w:ascii="Wingdings" w:hAnsi="Wingdings" w:hint="default"/>
+        <w:sz w:val="20"/>
+      </w:rPr>
+    </w:lvl>
+    <w:lvl w:ilvl="4" w:tentative="1">
+      <w:start w:val="1"/>
+      <w:numFmt w:val="bullet"/>
+      <w:lvlText w:val=""/>
+      <w:lvlJc w:val="left"/>
+      <w:pPr>
+        <w:tabs>
+          <w:tab w:val="num" w:pos="3600"/>
+        </w:tabs>
+        <w:ind w:left="3600" w:hanging="360"/>
+      </w:pPr>
+      <w:rPr>
+        <w:rFonts w:ascii="Wingdings" w:hAnsi="Wingdings" w:hint="default"/>
+        <w:sz w:val="20"/>
+      </w:rPr>
+    </w:lvl>
+    <w:lvl w:ilvl="5" w:tentative="1">
+      <w:start w:val="1"/>
+      <w:numFmt w:val="bullet"/>
+      <w:lvlText w:val=""/>
+      <w:lvlJc w:val="left"/>
+      <w:pPr>
+        <w:tabs>
+          <w:tab w:val="num" w:pos="4320"/>
+        </w:tabs>
+        <w:ind w:left="4320" w:hanging="360"/>
+      </w:pPr>
+      <w:rPr>
+        <w:rFonts w:ascii="Wingdings" w:hAnsi="Wingdings" w:hint="default"/>
+        <w:sz w:val="20"/>
+      </w:rPr>
+    </w:lvl>
+    <w:lvl w:ilvl="6" w:tentative="1">
+      <w:start w:val="1"/>
+      <w:numFmt w:val="bullet"/>
+      <w:lvlText w:val=""/>
+      <w:lvlJc w:val="left"/>
+      <w:pPr>
+        <w:tabs>
+          <w:tab w:val="num" w:pos="5040"/>
+        </w:tabs>
+        <w:ind w:left="5040" w:hanging="360"/>
+      </w:pPr>
+      <w:rPr>
+        <w:rFonts w:ascii="Wingdings" w:hAnsi="Wingdings" w:hint="default"/>
+        <w:sz w:val="20"/>
+      </w:rPr>
+    </w:lvl>
+    <w:lvl w:ilvl="7" w:tentative="1">
+      <w:start w:val="1"/>
+      <w:numFmt w:val="bullet"/>
+      <w:lvlText w:val=""/>
+      <w:lvlJc w:val="left"/>
+      <w:pPr>
+        <w:tabs>
+          <w:tab w:val="num" w:pos="5760"/>
+        </w:tabs>
+        <w:ind w:left="5760" w:hanging="360"/>
+      </w:pPr>
+      <w:rPr>
+        <w:rFonts w:ascii="Wingdings" w:hAnsi="Wingdings" w:hint="default"/>
+        <w:sz w:val="20"/>
+      </w:rPr>
+    </w:lvl>
+    <w:lvl w:ilvl="8" w:tentative="1">
+      <w:start w:val="1"/>
+      <w:numFmt w:val="bullet"/>
+      <w:lvlText w:val=""/>
+      <w:lvlJc w:val="left"/>
+      <w:pPr>
+        <w:tabs>
+          <w:tab w:val="num" w:pos="6480"/>
+        </w:tabs>
+        <w:ind w:left="6480" w:hanging="360"/>
+      </w:pPr>
+      <w:rPr>
+        <w:rFonts w:ascii="Wingdings" w:hAnsi="Wingdings" w:hint="default"/>
+        <w:sz w:val="20"/>
+      </w:rPr>
+    </w:lvl>
+  </w:abstractNum>
+  <w:abstractNum w:abstractNumId="8" w15:restartNumberingAfterBreak="0">
     <w:nsid w:val="75F057CE"/>
     <w:multiLevelType w:val="multilevel"/>
     <w:tmpl w:val="AA1A3070"/>
@@ -2669,7 +3864,7 @@
       </w:rPr>
     </w:lvl>
   </w:abstractNum>
-  <w:abstractNum w:abstractNumId="7" w15:restartNumberingAfterBreak="0">
+  <w:abstractNum w:abstractNumId="9" w15:restartNumberingAfterBreak="0">
     <w:nsid w:val="76097671"/>
     <w:multiLevelType w:val="multilevel"/>
     <w:tmpl w:val="40545E18"/>
@@ -2831,16 +4026,22 @@
     <w:abstractNumId w:val="1"/>
   </w:num>
   <w:num w:numId="5" w16cid:durableId="1443573979">
-    <w:abstractNumId w:val="6"/>
+    <w:abstractNumId w:val="8"/>
   </w:num>
   <w:num w:numId="6" w16cid:durableId="1925414819">
     <w:abstractNumId w:val="2"/>
   </w:num>
   <w:num w:numId="7" w16cid:durableId="579022772">
-    <w:abstractNumId w:val="7"/>
+    <w:abstractNumId w:val="9"/>
   </w:num>
   <w:num w:numId="8" w16cid:durableId="1287353506">
     <w:abstractNumId w:val="4"/>
+  </w:num>
+  <w:num w:numId="9" w16cid:durableId="1434590034">
+    <w:abstractNumId w:val="7"/>
+  </w:num>
+  <w:num w:numId="10" w16cid:durableId="189803892">
+    <w:abstractNumId w:val="6"/>
   </w:num>
   <w:numIdMacAtCleanup w:val="7"/>
 </w:numbering>
@@ -3449,7 +4650,6 @@
   <w:style w:type="character" w:default="1" w:styleId="a0">
     <w:name w:val="Default Paragraph Font"/>
     <w:uiPriority w:val="1"/>
-    <w:semiHidden/>
     <w:unhideWhenUsed/>
   </w:style>
   <w:style w:type="table" w:default="1" w:styleId="a1">

</xml_diff>

<commit_message>
Fix NutrientItem target type and conditional progress bar visibility in summary bar
</commit_message>
<xml_diff>
--- a/Програма мій помічник в дієті.docx
+++ b/Програма мій помічник в дієті.docx
@@ -2580,6 +2580,357 @@
       <w:proofErr w:type="spellEnd"/>
       <w:r>
         <w:t>.</w:t>
+      </w:r>
+    </w:p>
+    <w:p>
+      <w:r>
+        <w:rPr>
+          <w:b/>
+          <w:bCs/>
+        </w:rPr>
+        <w:t>Звіт про виконані зміни та виправлення (25.08.2026)</w:t>
+      </w:r>
+    </w:p>
+    <w:p>
+      <w:pPr>
+        <w:numPr>
+          <w:ilvl w:val="0"/>
+          <w:numId w:val="11"/>
+        </w:numPr>
+      </w:pPr>
+      <w:r>
+        <w:rPr>
+          <w:b/>
+          <w:bCs/>
+        </w:rPr>
+        <w:t>Виправлення сумісності типів цілей нутрієнтів (</w:t>
+      </w:r>
+      <w:proofErr w:type="spellStart"/>
+      <w:r>
+        <w:rPr>
+          <w:b/>
+          <w:bCs/>
+        </w:rPr>
+        <w:t>double</w:t>
+      </w:r>
+      <w:proofErr w:type="spellEnd"/>
+      <w:r>
+        <w:rPr>
+          <w:b/>
+          <w:bCs/>
+        </w:rPr>
+        <w:t>?):</w:t>
+      </w:r>
+      <w:r>
+        <w:t xml:space="preserve"> У </w:t>
+      </w:r>
+      <w:proofErr w:type="spellStart"/>
+      <w:r>
+        <w:t>віджеті</w:t>
+      </w:r>
+      <w:proofErr w:type="spellEnd"/>
+      <w:r>
+        <w:t xml:space="preserve"> </w:t>
+      </w:r>
+      <w:proofErr w:type="spellStart"/>
+      <w:r>
+        <w:t>daily_summary_bar_widget.dart</w:t>
+      </w:r>
+      <w:proofErr w:type="spellEnd"/>
+      <w:r>
+        <w:t xml:space="preserve"> тип поля </w:t>
+      </w:r>
+      <w:proofErr w:type="spellStart"/>
+      <w:r>
+        <w:t>target</w:t>
+      </w:r>
+      <w:proofErr w:type="spellEnd"/>
+      <w:r>
+        <w:t xml:space="preserve"> в узагальненій моделі </w:t>
+      </w:r>
+      <w:proofErr w:type="spellStart"/>
+      <w:r>
+        <w:t>NutrientItem</w:t>
+      </w:r>
+      <w:proofErr w:type="spellEnd"/>
+      <w:r>
+        <w:t xml:space="preserve"> змінено з обов'язкового </w:t>
+      </w:r>
+      <w:proofErr w:type="spellStart"/>
+      <w:r>
+        <w:t>double</w:t>
+      </w:r>
+      <w:proofErr w:type="spellEnd"/>
+      <w:r>
+        <w:t xml:space="preserve"> на </w:t>
+      </w:r>
+      <w:proofErr w:type="spellStart"/>
+      <w:r>
+        <w:t>нульований</w:t>
+      </w:r>
+      <w:proofErr w:type="spellEnd"/>
+      <w:r>
+        <w:t xml:space="preserve"> </w:t>
+      </w:r>
+      <w:proofErr w:type="spellStart"/>
+      <w:r>
+        <w:t>double</w:t>
+      </w:r>
+      <w:proofErr w:type="spellEnd"/>
+      <w:r>
+        <w:t xml:space="preserve">?. Це усунуло помилку компіляції типу </w:t>
+      </w:r>
+      <w:proofErr w:type="spellStart"/>
+      <w:r>
+        <w:t>The</w:t>
+      </w:r>
+      <w:proofErr w:type="spellEnd"/>
+      <w:r>
+        <w:t xml:space="preserve"> </w:t>
+      </w:r>
+      <w:proofErr w:type="spellStart"/>
+      <w:r>
+        <w:t>argument</w:t>
+      </w:r>
+      <w:proofErr w:type="spellEnd"/>
+      <w:r>
+        <w:t xml:space="preserve"> </w:t>
+      </w:r>
+      <w:proofErr w:type="spellStart"/>
+      <w:r>
+        <w:t>type</w:t>
+      </w:r>
+      <w:proofErr w:type="spellEnd"/>
+      <w:r>
+        <w:t xml:space="preserve"> '</w:t>
+      </w:r>
+      <w:proofErr w:type="spellStart"/>
+      <w:r>
+        <w:t>double</w:t>
+      </w:r>
+      <w:proofErr w:type="spellEnd"/>
+      <w:r>
+        <w:t xml:space="preserve">?' </w:t>
+      </w:r>
+      <w:proofErr w:type="spellStart"/>
+      <w:r>
+        <w:t>can't</w:t>
+      </w:r>
+      <w:proofErr w:type="spellEnd"/>
+      <w:r>
+        <w:t xml:space="preserve"> </w:t>
+      </w:r>
+      <w:proofErr w:type="spellStart"/>
+      <w:r>
+        <w:t>be</w:t>
+      </w:r>
+      <w:proofErr w:type="spellEnd"/>
+      <w:r>
+        <w:t xml:space="preserve"> </w:t>
+      </w:r>
+      <w:proofErr w:type="spellStart"/>
+      <w:r>
+        <w:t>assigned</w:t>
+      </w:r>
+      <w:proofErr w:type="spellEnd"/>
+      <w:r>
+        <w:t xml:space="preserve"> </w:t>
+      </w:r>
+      <w:proofErr w:type="spellStart"/>
+      <w:r>
+        <w:t>to</w:t>
+      </w:r>
+      <w:proofErr w:type="spellEnd"/>
+      <w:r>
+        <w:t xml:space="preserve"> </w:t>
+      </w:r>
+      <w:proofErr w:type="spellStart"/>
+      <w:r>
+        <w:t>the</w:t>
+      </w:r>
+      <w:proofErr w:type="spellEnd"/>
+      <w:r>
+        <w:t xml:space="preserve"> </w:t>
+      </w:r>
+      <w:proofErr w:type="spellStart"/>
+      <w:r>
+        <w:t>parameter</w:t>
+      </w:r>
+      <w:proofErr w:type="spellEnd"/>
+      <w:r>
+        <w:t xml:space="preserve"> </w:t>
+      </w:r>
+      <w:proofErr w:type="spellStart"/>
+      <w:r>
+        <w:t>type</w:t>
+      </w:r>
+      <w:proofErr w:type="spellEnd"/>
+      <w:r>
+        <w:t xml:space="preserve"> '</w:t>
+      </w:r>
+      <w:proofErr w:type="spellStart"/>
+      <w:r>
+        <w:t>double</w:t>
+      </w:r>
+      <w:proofErr w:type="spellEnd"/>
+      <w:r>
+        <w:t xml:space="preserve">', оскільки сервіс налаштувань цільових норм </w:t>
+      </w:r>
+      <w:proofErr w:type="spellStart"/>
+      <w:r>
+        <w:t>DietSettingsService</w:t>
+      </w:r>
+      <w:proofErr w:type="spellEnd"/>
+      <w:r>
+        <w:t xml:space="preserve"> повертає </w:t>
+      </w:r>
+      <w:proofErr w:type="spellStart"/>
+      <w:r>
+        <w:t>опціональні</w:t>
+      </w:r>
+      <w:proofErr w:type="spellEnd"/>
+      <w:r>
+        <w:t xml:space="preserve"> значення (ціль може бути вказана не для всіх нутрієнтів).</w:t>
+      </w:r>
+    </w:p>
+    <w:p>
+      <w:pPr>
+        <w:numPr>
+          <w:ilvl w:val="0"/>
+          <w:numId w:val="11"/>
+        </w:numPr>
+      </w:pPr>
+      <w:r>
+        <w:rPr>
+          <w:b/>
+          <w:bCs/>
+        </w:rPr>
+        <w:t xml:space="preserve">Синхронізація логіки виводу </w:t>
+      </w:r>
+      <w:proofErr w:type="spellStart"/>
+      <w:r>
+        <w:rPr>
+          <w:b/>
+          <w:bCs/>
+        </w:rPr>
+        <w:t>полоски</w:t>
+      </w:r>
+      <w:proofErr w:type="spellEnd"/>
+      <w:r>
+        <w:rPr>
+          <w:b/>
+          <w:bCs/>
+        </w:rPr>
+        <w:t xml:space="preserve"> прогресу:</w:t>
+      </w:r>
+      <w:r>
+        <w:t xml:space="preserve"> Проведено уніфікацію відображення індикатора прогресу </w:t>
+      </w:r>
+      <w:proofErr w:type="spellStart"/>
+      <w:r>
+        <w:t>LinearProgressIndicator</w:t>
+      </w:r>
+      <w:proofErr w:type="spellEnd"/>
+      <w:r>
+        <w:t xml:space="preserve"> між блоками головного екрана та </w:t>
+      </w:r>
+      <w:proofErr w:type="spellStart"/>
+      <w:r>
+        <w:t>слайдером</w:t>
+      </w:r>
+      <w:proofErr w:type="spellEnd"/>
+      <w:r>
+        <w:t xml:space="preserve"> детального екрана. Додано перевірку </w:t>
+      </w:r>
+      <w:proofErr w:type="spellStart"/>
+      <w:r>
+        <w:t>if</w:t>
+      </w:r>
+      <w:proofErr w:type="spellEnd"/>
+      <w:r>
+        <w:t xml:space="preserve"> (</w:t>
+      </w:r>
+      <w:proofErr w:type="spellStart"/>
+      <w:r>
+        <w:t>hasTarget</w:t>
+      </w:r>
+      <w:proofErr w:type="spellEnd"/>
+      <w:r>
+        <w:t xml:space="preserve">) — якщо ціль </w:t>
+      </w:r>
+      <w:proofErr w:type="spellStart"/>
+      <w:r>
+        <w:t>нутрієнта</w:t>
+      </w:r>
+      <w:proofErr w:type="spellEnd"/>
+      <w:r>
+        <w:t xml:space="preserve"> дорівнює </w:t>
+      </w:r>
+      <w:proofErr w:type="spellStart"/>
+      <w:r>
+        <w:t>null</w:t>
+      </w:r>
+      <w:proofErr w:type="spellEnd"/>
+      <w:r>
+        <w:t xml:space="preserve"> або 0, кольорова </w:t>
+      </w:r>
+      <w:proofErr w:type="spellStart"/>
+      <w:r>
+        <w:t>полоска</w:t>
+      </w:r>
+      <w:proofErr w:type="spellEnd"/>
+      <w:r>
+        <w:t xml:space="preserve"> внизу плитки автоматично приховується, залишаючи на плитці тільки значення поточного споживання.</w:t>
+      </w:r>
+    </w:p>
+    <w:p>
+      <w:pPr>
+        <w:numPr>
+          <w:ilvl w:val="0"/>
+          <w:numId w:val="11"/>
+        </w:numPr>
+      </w:pPr>
+      <w:r>
+        <w:rPr>
+          <w:b/>
+          <w:bCs/>
+        </w:rPr>
+        <w:t>Підготовка до архітектурної декомпозиції:</w:t>
+      </w:r>
+      <w:r>
+        <w:t xml:space="preserve"> Проведено аналіз та сформовано безпечний план розділення монолітного файлу </w:t>
+      </w:r>
+      <w:proofErr w:type="spellStart"/>
+      <w:r>
+        <w:t>daily_summary_bar_widget.dart</w:t>
+      </w:r>
+      <w:proofErr w:type="spellEnd"/>
+      <w:r>
+        <w:t xml:space="preserve"> на 3 модульні компоненти: модель даних (</w:t>
+      </w:r>
+      <w:proofErr w:type="spellStart"/>
+      <w:r>
+        <w:t>nutrient_item.dart</w:t>
+      </w:r>
+      <w:proofErr w:type="spellEnd"/>
+      <w:r>
+        <w:t xml:space="preserve">), </w:t>
+      </w:r>
+      <w:proofErr w:type="spellStart"/>
+      <w:r>
+        <w:t>віджет</w:t>
+      </w:r>
+      <w:proofErr w:type="spellEnd"/>
+      <w:r>
+        <w:t xml:space="preserve"> плитки (</w:t>
+      </w:r>
+      <w:proofErr w:type="spellStart"/>
+      <w:r>
+        <w:t>nutrient_tile_widget.dart</w:t>
+      </w:r>
+      <w:proofErr w:type="spellEnd"/>
+      <w:r>
+        <w:t>) та головну карусель-контейнер.</w:t>
       </w:r>
     </w:p>
     <w:p/>
@@ -3716,6 +4067,119 @@
     </w:lvl>
   </w:abstractNum>
   <w:abstractNum w:abstractNumId="8" w15:restartNumberingAfterBreak="0">
+    <w:nsid w:val="4F233EA8"/>
+    <w:multiLevelType w:val="multilevel"/>
+    <w:tmpl w:val="09EE5416"/>
+    <w:lvl w:ilvl="0">
+      <w:start w:val="1"/>
+      <w:numFmt w:val="decimal"/>
+      <w:lvlText w:val="%1."/>
+      <w:lvlJc w:val="left"/>
+      <w:pPr>
+        <w:tabs>
+          <w:tab w:val="num" w:pos="720"/>
+        </w:tabs>
+        <w:ind w:left="720" w:hanging="360"/>
+      </w:pPr>
+    </w:lvl>
+    <w:lvl w:ilvl="1" w:tentative="1">
+      <w:start w:val="1"/>
+      <w:numFmt w:val="decimal"/>
+      <w:lvlText w:val="%2."/>
+      <w:lvlJc w:val="left"/>
+      <w:pPr>
+        <w:tabs>
+          <w:tab w:val="num" w:pos="1440"/>
+        </w:tabs>
+        <w:ind w:left="1440" w:hanging="360"/>
+      </w:pPr>
+    </w:lvl>
+    <w:lvl w:ilvl="2" w:tentative="1">
+      <w:start w:val="1"/>
+      <w:numFmt w:val="decimal"/>
+      <w:lvlText w:val="%3."/>
+      <w:lvlJc w:val="left"/>
+      <w:pPr>
+        <w:tabs>
+          <w:tab w:val="num" w:pos="2160"/>
+        </w:tabs>
+        <w:ind w:left="2160" w:hanging="360"/>
+      </w:pPr>
+    </w:lvl>
+    <w:lvl w:ilvl="3" w:tentative="1">
+      <w:start w:val="1"/>
+      <w:numFmt w:val="decimal"/>
+      <w:lvlText w:val="%4."/>
+      <w:lvlJc w:val="left"/>
+      <w:pPr>
+        <w:tabs>
+          <w:tab w:val="num" w:pos="2880"/>
+        </w:tabs>
+        <w:ind w:left="2880" w:hanging="360"/>
+      </w:pPr>
+    </w:lvl>
+    <w:lvl w:ilvl="4" w:tentative="1">
+      <w:start w:val="1"/>
+      <w:numFmt w:val="decimal"/>
+      <w:lvlText w:val="%5."/>
+      <w:lvlJc w:val="left"/>
+      <w:pPr>
+        <w:tabs>
+          <w:tab w:val="num" w:pos="3600"/>
+        </w:tabs>
+        <w:ind w:left="3600" w:hanging="360"/>
+      </w:pPr>
+    </w:lvl>
+    <w:lvl w:ilvl="5" w:tentative="1">
+      <w:start w:val="1"/>
+      <w:numFmt w:val="decimal"/>
+      <w:lvlText w:val="%6."/>
+      <w:lvlJc w:val="left"/>
+      <w:pPr>
+        <w:tabs>
+          <w:tab w:val="num" w:pos="4320"/>
+        </w:tabs>
+        <w:ind w:left="4320" w:hanging="360"/>
+      </w:pPr>
+    </w:lvl>
+    <w:lvl w:ilvl="6" w:tentative="1">
+      <w:start w:val="1"/>
+      <w:numFmt w:val="decimal"/>
+      <w:lvlText w:val="%7."/>
+      <w:lvlJc w:val="left"/>
+      <w:pPr>
+        <w:tabs>
+          <w:tab w:val="num" w:pos="5040"/>
+        </w:tabs>
+        <w:ind w:left="5040" w:hanging="360"/>
+      </w:pPr>
+    </w:lvl>
+    <w:lvl w:ilvl="7" w:tentative="1">
+      <w:start w:val="1"/>
+      <w:numFmt w:val="decimal"/>
+      <w:lvlText w:val="%8."/>
+      <w:lvlJc w:val="left"/>
+      <w:pPr>
+        <w:tabs>
+          <w:tab w:val="num" w:pos="5760"/>
+        </w:tabs>
+        <w:ind w:left="5760" w:hanging="360"/>
+      </w:pPr>
+    </w:lvl>
+    <w:lvl w:ilvl="8" w:tentative="1">
+      <w:start w:val="1"/>
+      <w:numFmt w:val="decimal"/>
+      <w:lvlText w:val="%9."/>
+      <w:lvlJc w:val="left"/>
+      <w:pPr>
+        <w:tabs>
+          <w:tab w:val="num" w:pos="6480"/>
+        </w:tabs>
+        <w:ind w:left="6480" w:hanging="360"/>
+      </w:pPr>
+    </w:lvl>
+  </w:abstractNum>
+  <w:abstractNum w:abstractNumId="9" w15:restartNumberingAfterBreak="0">
     <w:nsid w:val="75F057CE"/>
     <w:multiLevelType w:val="multilevel"/>
     <w:tmpl w:val="AA1A3070"/>
@@ -3864,7 +4328,7 @@
       </w:rPr>
     </w:lvl>
   </w:abstractNum>
-  <w:abstractNum w:abstractNumId="9" w15:restartNumberingAfterBreak="0">
+  <w:abstractNum w:abstractNumId="10" w15:restartNumberingAfterBreak="0">
     <w:nsid w:val="76097671"/>
     <w:multiLevelType w:val="multilevel"/>
     <w:tmpl w:val="40545E18"/>
@@ -4026,13 +4490,13 @@
     <w:abstractNumId w:val="1"/>
   </w:num>
   <w:num w:numId="5" w16cid:durableId="1443573979">
-    <w:abstractNumId w:val="8"/>
+    <w:abstractNumId w:val="9"/>
   </w:num>
   <w:num w:numId="6" w16cid:durableId="1925414819">
     <w:abstractNumId w:val="2"/>
   </w:num>
   <w:num w:numId="7" w16cid:durableId="579022772">
-    <w:abstractNumId w:val="9"/>
+    <w:abstractNumId w:val="10"/>
   </w:num>
   <w:num w:numId="8" w16cid:durableId="1287353506">
     <w:abstractNumId w:val="4"/>
@@ -4042,6 +4506,9 @@
   </w:num>
   <w:num w:numId="10" w16cid:durableId="189803892">
     <w:abstractNumId w:val="6"/>
+  </w:num>
+  <w:num w:numId="11" w16cid:durableId="264846074">
+    <w:abstractNumId w:val="8"/>
   </w:num>
   <w:numIdMacAtCleanup w:val="7"/>
 </w:numbering>

</xml_diff>

<commit_message>
refactor: modularize products base widget, add adaptive product card and smart search sorting
</commit_message>
<xml_diff>
--- a/Програма мій помічник в дієті.docx
+++ b/Програма мій помічник в дієті.docx
@@ -2931,6 +2931,279 @@
       <w:proofErr w:type="spellEnd"/>
       <w:r>
         <w:t>) та головну карусель-контейнер.</w:t>
+      </w:r>
+    </w:p>
+    <w:p>
+      <w:r>
+        <w:t xml:space="preserve">Ось готовий фрагмент для звіту Word (Пункт 17), оновлене дерево проєкту та покрокова інструкція для збереження змін на </w:t>
+      </w:r>
+      <w:proofErr w:type="spellStart"/>
+      <w:r>
+        <w:t>GitHub</w:t>
+      </w:r>
+      <w:proofErr w:type="spellEnd"/>
+      <w:r>
+        <w:t>.</w:t>
+      </w:r>
+    </w:p>
+    <w:p>
+      <w:pPr>
+        <w:rPr>
+          <w:b/>
+          <w:bCs/>
+        </w:rPr>
+      </w:pPr>
+      <w:r>
+        <w:rPr>
+          <w:b/>
+          <w:bCs/>
+        </w:rPr>
+        <w:t>17. Модульна декомпозиція бази продуктів та гнучка обробка нутрієнтів (26.08.2026)</w:t>
+      </w:r>
+    </w:p>
+    <w:p>
+      <w:pPr>
+        <w:numPr>
+          <w:ilvl w:val="0"/>
+          <w:numId w:val="12"/>
+        </w:numPr>
+      </w:pPr>
+      <w:r>
+        <w:rPr>
+          <w:b/>
+          <w:bCs/>
+        </w:rPr>
+        <w:t>Розширення моделі продуктів (</w:t>
+      </w:r>
+      <w:proofErr w:type="spellStart"/>
+      <w:r>
+        <w:rPr>
+          <w:b/>
+          <w:bCs/>
+        </w:rPr>
+        <w:t>ProductModel</w:t>
+      </w:r>
+      <w:proofErr w:type="spellEnd"/>
+      <w:r>
+        <w:rPr>
+          <w:b/>
+          <w:bCs/>
+        </w:rPr>
+        <w:t>)</w:t>
+      </w:r>
+      <w:r>
+        <w:t xml:space="preserve">: Додано гнучку </w:t>
+      </w:r>
+      <w:proofErr w:type="spellStart"/>
+      <w:r>
+        <w:t>десеріалізацію</w:t>
+      </w:r>
+      <w:proofErr w:type="spellEnd"/>
+      <w:r>
+        <w:t xml:space="preserve"> за допомогою універсального </w:t>
+      </w:r>
+      <w:proofErr w:type="spellStart"/>
+      <w:r>
+        <w:t>парсера</w:t>
+      </w:r>
+      <w:proofErr w:type="spellEnd"/>
+      <w:r>
+        <w:t xml:space="preserve"> ключів, який розпізнає варіації назв амінокислот та нутрієнтів (англійські скорочення </w:t>
+      </w:r>
+      <w:proofErr w:type="spellStart"/>
+      <w:r>
+        <w:t>tyr</w:t>
+      </w:r>
+      <w:proofErr w:type="spellEnd"/>
+      <w:r>
+        <w:t xml:space="preserve">, </w:t>
+      </w:r>
+      <w:proofErr w:type="spellStart"/>
+      <w:r>
+        <w:t>leu</w:t>
+      </w:r>
+      <w:proofErr w:type="spellEnd"/>
+      <w:r>
+        <w:t xml:space="preserve">, </w:t>
+      </w:r>
+      <w:proofErr w:type="spellStart"/>
+      <w:r>
+        <w:t>met</w:t>
+      </w:r>
+      <w:proofErr w:type="spellEnd"/>
+      <w:r>
+        <w:t xml:space="preserve">, </w:t>
+      </w:r>
+      <w:proofErr w:type="spellStart"/>
+      <w:r>
+        <w:t>lys</w:t>
+      </w:r>
+      <w:proofErr w:type="spellEnd"/>
+      <w:r>
+        <w:t xml:space="preserve">, </w:t>
+      </w:r>
+      <w:proofErr w:type="spellStart"/>
+      <w:r>
+        <w:t>kcal</w:t>
+      </w:r>
+      <w:proofErr w:type="spellEnd"/>
+      <w:r>
+        <w:t xml:space="preserve"> та українські назви). Це усунуло проблему з відображенням нульових значень при наявності даних у JSON-базі.</w:t>
+      </w:r>
+    </w:p>
+    <w:p>
+      <w:pPr>
+        <w:numPr>
+          <w:ilvl w:val="0"/>
+          <w:numId w:val="12"/>
+        </w:numPr>
+      </w:pPr>
+      <w:r>
+        <w:rPr>
+          <w:b/>
+          <w:bCs/>
+        </w:rPr>
+        <w:t xml:space="preserve">Декомпозиція архітектури </w:t>
+      </w:r>
+      <w:proofErr w:type="spellStart"/>
+      <w:r>
+        <w:rPr>
+          <w:b/>
+          <w:bCs/>
+        </w:rPr>
+        <w:t>віджета</w:t>
+      </w:r>
+      <w:proofErr w:type="spellEnd"/>
+      <w:r>
+        <w:t xml:space="preserve">: Виконано </w:t>
+      </w:r>
+      <w:proofErr w:type="spellStart"/>
+      <w:r>
+        <w:t>рефакторинг</w:t>
+      </w:r>
+      <w:proofErr w:type="spellEnd"/>
+      <w:r>
+        <w:t xml:space="preserve"> монолітного екрана шляхом винесення </w:t>
+      </w:r>
+      <w:proofErr w:type="spellStart"/>
+      <w:r>
+        <w:t>перевикористовуваних</w:t>
+      </w:r>
+      <w:proofErr w:type="spellEnd"/>
+      <w:r>
+        <w:t xml:space="preserve"> елементів у </w:t>
+      </w:r>
+      <w:proofErr w:type="spellStart"/>
+      <w:r>
+        <w:t>підпапку</w:t>
+      </w:r>
+      <w:proofErr w:type="spellEnd"/>
+      <w:r>
+        <w:t xml:space="preserve"> </w:t>
+      </w:r>
+      <w:r>
+        <w:lastRenderedPageBreak/>
+        <w:t xml:space="preserve">lib/widgets/databases_and_resources_widget/products_base_widget/. Створено ізольовані </w:t>
+      </w:r>
+      <w:proofErr w:type="spellStart"/>
+      <w:r>
+        <w:t>віджети</w:t>
+      </w:r>
+      <w:proofErr w:type="spellEnd"/>
+      <w:r>
+        <w:t>:</w:t>
+      </w:r>
+    </w:p>
+    <w:p>
+      <w:pPr>
+        <w:numPr>
+          <w:ilvl w:val="1"/>
+          <w:numId w:val="12"/>
+        </w:numPr>
+      </w:pPr>
+      <w:proofErr w:type="spellStart"/>
+      <w:r>
+        <w:t>ProductSearchBarWidget</w:t>
+      </w:r>
+      <w:proofErr w:type="spellEnd"/>
+      <w:r>
+        <w:t xml:space="preserve"> — поле пошуку зі швидким очищенням.</w:t>
+      </w:r>
+    </w:p>
+    <w:p>
+      <w:pPr>
+        <w:numPr>
+          <w:ilvl w:val="1"/>
+          <w:numId w:val="12"/>
+        </w:numPr>
+      </w:pPr>
+      <w:proofErr w:type="spellStart"/>
+      <w:r>
+        <w:t>ProductCardWidget</w:t>
+      </w:r>
+      <w:proofErr w:type="spellEnd"/>
+      <w:r>
+        <w:t xml:space="preserve"> — картка продукту із зеленим акцентним </w:t>
+      </w:r>
+      <w:proofErr w:type="spellStart"/>
+      <w:r>
+        <w:t>рамкуванням</w:t>
+      </w:r>
+      <w:proofErr w:type="spellEnd"/>
+      <w:r>
+        <w:t>, згорнутим станом основних метрик та розгортанням усіх додаткових амінокислот.</w:t>
+      </w:r>
+    </w:p>
+    <w:p>
+      <w:pPr>
+        <w:numPr>
+          <w:ilvl w:val="0"/>
+          <w:numId w:val="12"/>
+        </w:numPr>
+      </w:pPr>
+      <w:r>
+        <w:rPr>
+          <w:b/>
+          <w:bCs/>
+        </w:rPr>
+        <w:t>Повнотекстові назви та адаптивна верстка</w:t>
+      </w:r>
+      <w:r>
+        <w:t xml:space="preserve">: Замінено скорочені позначення нутрієнтів на повні українські найменування (Калорії, Фенілаланін, Білки, Жири, Вуглеводи). Завдяки компоновці </w:t>
+      </w:r>
+      <w:proofErr w:type="spellStart"/>
+      <w:r>
+        <w:t>Wrap</w:t>
+      </w:r>
+      <w:proofErr w:type="spellEnd"/>
+      <w:r>
+        <w:t xml:space="preserve"> елементи гармонійно адаптуються під мобільні екрани та ПК.</w:t>
+      </w:r>
+    </w:p>
+    <w:p>
+      <w:pPr>
+        <w:numPr>
+          <w:ilvl w:val="0"/>
+          <w:numId w:val="12"/>
+        </w:numPr>
+      </w:pPr>
+      <w:r>
+        <w:rPr>
+          <w:b/>
+          <w:bCs/>
+        </w:rPr>
+        <w:t>Алгоритм розумного сортування</w:t>
+      </w:r>
+      <w:r>
+        <w:t xml:space="preserve">: Впроваджено багаторівневе сортування результатів пошуку за </w:t>
+      </w:r>
+      <w:proofErr w:type="spellStart"/>
+      <w:r>
+        <w:t>релевантністю</w:t>
+      </w:r>
+      <w:proofErr w:type="spellEnd"/>
+      <w:r>
+        <w:t>: точний збіг назви -&gt; назва починається із запиту -&gt; алфавітний порядок.</w:t>
       </w:r>
     </w:p>
     <w:p/>
@@ -3769,6 +4042,155 @@
     </w:lvl>
   </w:abstractNum>
   <w:abstractNum w:abstractNumId="6" w15:restartNumberingAfterBreak="0">
+    <w:nsid w:val="498A7E76"/>
+    <w:multiLevelType w:val="multilevel"/>
+    <w:tmpl w:val="A2BA56A4"/>
+    <w:lvl w:ilvl="0">
+      <w:start w:val="1"/>
+      <w:numFmt w:val="bullet"/>
+      <w:lvlText w:val=""/>
+      <w:lvlJc w:val="left"/>
+      <w:pPr>
+        <w:tabs>
+          <w:tab w:val="num" w:pos="720"/>
+        </w:tabs>
+        <w:ind w:left="720" w:hanging="360"/>
+      </w:pPr>
+      <w:rPr>
+        <w:rFonts w:ascii="Symbol" w:hAnsi="Symbol" w:hint="default"/>
+        <w:sz w:val="20"/>
+      </w:rPr>
+    </w:lvl>
+    <w:lvl w:ilvl="1">
+      <w:start w:val="1"/>
+      <w:numFmt w:val="bullet"/>
+      <w:lvlText w:val="o"/>
+      <w:lvlJc w:val="left"/>
+      <w:pPr>
+        <w:tabs>
+          <w:tab w:val="num" w:pos="1440"/>
+        </w:tabs>
+        <w:ind w:left="1440" w:hanging="360"/>
+      </w:pPr>
+      <w:rPr>
+        <w:rFonts w:ascii="Courier New" w:hAnsi="Courier New" w:hint="default"/>
+        <w:sz w:val="20"/>
+      </w:rPr>
+    </w:lvl>
+    <w:lvl w:ilvl="2" w:tentative="1">
+      <w:start w:val="1"/>
+      <w:numFmt w:val="bullet"/>
+      <w:lvlText w:val=""/>
+      <w:lvlJc w:val="left"/>
+      <w:pPr>
+        <w:tabs>
+          <w:tab w:val="num" w:pos="2160"/>
+        </w:tabs>
+        <w:ind w:left="2160" w:hanging="360"/>
+      </w:pPr>
+      <w:rPr>
+        <w:rFonts w:ascii="Wingdings" w:hAnsi="Wingdings" w:hint="default"/>
+        <w:sz w:val="20"/>
+      </w:rPr>
+    </w:lvl>
+    <w:lvl w:ilvl="3" w:tentative="1">
+      <w:start w:val="1"/>
+      <w:numFmt w:val="bullet"/>
+      <w:lvlText w:val=""/>
+      <w:lvlJc w:val="left"/>
+      <w:pPr>
+        <w:tabs>
+          <w:tab w:val="num" w:pos="2880"/>
+        </w:tabs>
+        <w:ind w:left="2880" w:hanging="360"/>
+      </w:pPr>
+      <w:rPr>
+        <w:rFonts w:ascii="Wingdings" w:hAnsi="Wingdings" w:hint="default"/>
+        <w:sz w:val="20"/>
+      </w:rPr>
+    </w:lvl>
+    <w:lvl w:ilvl="4" w:tentative="1">
+      <w:start w:val="1"/>
+      <w:numFmt w:val="bullet"/>
+      <w:lvlText w:val=""/>
+      <w:lvlJc w:val="left"/>
+      <w:pPr>
+        <w:tabs>
+          <w:tab w:val="num" w:pos="3600"/>
+        </w:tabs>
+        <w:ind w:left="3600" w:hanging="360"/>
+      </w:pPr>
+      <w:rPr>
+        <w:rFonts w:ascii="Wingdings" w:hAnsi="Wingdings" w:hint="default"/>
+        <w:sz w:val="20"/>
+      </w:rPr>
+    </w:lvl>
+    <w:lvl w:ilvl="5" w:tentative="1">
+      <w:start w:val="1"/>
+      <w:numFmt w:val="bullet"/>
+      <w:lvlText w:val=""/>
+      <w:lvlJc w:val="left"/>
+      <w:pPr>
+        <w:tabs>
+          <w:tab w:val="num" w:pos="4320"/>
+        </w:tabs>
+        <w:ind w:left="4320" w:hanging="360"/>
+      </w:pPr>
+      <w:rPr>
+        <w:rFonts w:ascii="Wingdings" w:hAnsi="Wingdings" w:hint="default"/>
+        <w:sz w:val="20"/>
+      </w:rPr>
+    </w:lvl>
+    <w:lvl w:ilvl="6" w:tentative="1">
+      <w:start w:val="1"/>
+      <w:numFmt w:val="bullet"/>
+      <w:lvlText w:val=""/>
+      <w:lvlJc w:val="left"/>
+      <w:pPr>
+        <w:tabs>
+          <w:tab w:val="num" w:pos="5040"/>
+        </w:tabs>
+        <w:ind w:left="5040" w:hanging="360"/>
+      </w:pPr>
+      <w:rPr>
+        <w:rFonts w:ascii="Wingdings" w:hAnsi="Wingdings" w:hint="default"/>
+        <w:sz w:val="20"/>
+      </w:rPr>
+    </w:lvl>
+    <w:lvl w:ilvl="7" w:tentative="1">
+      <w:start w:val="1"/>
+      <w:numFmt w:val="bullet"/>
+      <w:lvlText w:val=""/>
+      <w:lvlJc w:val="left"/>
+      <w:pPr>
+        <w:tabs>
+          <w:tab w:val="num" w:pos="5760"/>
+        </w:tabs>
+        <w:ind w:left="5760" w:hanging="360"/>
+      </w:pPr>
+      <w:rPr>
+        <w:rFonts w:ascii="Wingdings" w:hAnsi="Wingdings" w:hint="default"/>
+        <w:sz w:val="20"/>
+      </w:rPr>
+    </w:lvl>
+    <w:lvl w:ilvl="8" w:tentative="1">
+      <w:start w:val="1"/>
+      <w:numFmt w:val="bullet"/>
+      <w:lvlText w:val=""/>
+      <w:lvlJc w:val="left"/>
+      <w:pPr>
+        <w:tabs>
+          <w:tab w:val="num" w:pos="6480"/>
+        </w:tabs>
+        <w:ind w:left="6480" w:hanging="360"/>
+      </w:pPr>
+      <w:rPr>
+        <w:rFonts w:ascii="Wingdings" w:hAnsi="Wingdings" w:hint="default"/>
+        <w:sz w:val="20"/>
+      </w:rPr>
+    </w:lvl>
+  </w:abstractNum>
+  <w:abstractNum w:abstractNumId="7" w15:restartNumberingAfterBreak="0">
     <w:nsid w:val="4AA84507"/>
     <w:multiLevelType w:val="multilevel"/>
     <w:tmpl w:val="B34E2D7A"/>
@@ -3917,7 +4339,7 @@
       </w:rPr>
     </w:lvl>
   </w:abstractNum>
-  <w:abstractNum w:abstractNumId="7" w15:restartNumberingAfterBreak="0">
+  <w:abstractNum w:abstractNumId="8" w15:restartNumberingAfterBreak="0">
     <w:nsid w:val="4C2D2D81"/>
     <w:multiLevelType w:val="multilevel"/>
     <w:tmpl w:val="B4B27EFA"/>
@@ -4066,7 +4488,7 @@
       </w:rPr>
     </w:lvl>
   </w:abstractNum>
-  <w:abstractNum w:abstractNumId="8" w15:restartNumberingAfterBreak="0">
+  <w:abstractNum w:abstractNumId="9" w15:restartNumberingAfterBreak="0">
     <w:nsid w:val="4F233EA8"/>
     <w:multiLevelType w:val="multilevel"/>
     <w:tmpl w:val="09EE5416"/>
@@ -4179,7 +4601,7 @@
       </w:pPr>
     </w:lvl>
   </w:abstractNum>
-  <w:abstractNum w:abstractNumId="9" w15:restartNumberingAfterBreak="0">
+  <w:abstractNum w:abstractNumId="10" w15:restartNumberingAfterBreak="0">
     <w:nsid w:val="75F057CE"/>
     <w:multiLevelType w:val="multilevel"/>
     <w:tmpl w:val="AA1A3070"/>
@@ -4328,7 +4750,7 @@
       </w:rPr>
     </w:lvl>
   </w:abstractNum>
-  <w:abstractNum w:abstractNumId="10" w15:restartNumberingAfterBreak="0">
+  <w:abstractNum w:abstractNumId="11" w15:restartNumberingAfterBreak="0">
     <w:nsid w:val="76097671"/>
     <w:multiLevelType w:val="multilevel"/>
     <w:tmpl w:val="40545E18"/>
@@ -4490,25 +4912,28 @@
     <w:abstractNumId w:val="1"/>
   </w:num>
   <w:num w:numId="5" w16cid:durableId="1443573979">
-    <w:abstractNumId w:val="9"/>
+    <w:abstractNumId w:val="10"/>
   </w:num>
   <w:num w:numId="6" w16cid:durableId="1925414819">
     <w:abstractNumId w:val="2"/>
   </w:num>
   <w:num w:numId="7" w16cid:durableId="579022772">
-    <w:abstractNumId w:val="10"/>
+    <w:abstractNumId w:val="11"/>
   </w:num>
   <w:num w:numId="8" w16cid:durableId="1287353506">
     <w:abstractNumId w:val="4"/>
   </w:num>
   <w:num w:numId="9" w16cid:durableId="1434590034">
+    <w:abstractNumId w:val="8"/>
+  </w:num>
+  <w:num w:numId="10" w16cid:durableId="189803892">
     <w:abstractNumId w:val="7"/>
   </w:num>
-  <w:num w:numId="10" w16cid:durableId="189803892">
+  <w:num w:numId="11" w16cid:durableId="264846074">
+    <w:abstractNumId w:val="9"/>
+  </w:num>
+  <w:num w:numId="12" w16cid:durableId="608852592">
     <w:abstractNumId w:val="6"/>
-  </w:num>
-  <w:num w:numId="11" w16cid:durableId="264846074">
-    <w:abstractNumId w:val="8"/>
   </w:num>
   <w:numIdMacAtCleanup w:val="7"/>
 </w:numbering>

</xml_diff>

<commit_message>
Fix inventory dish ingredients synchronization and update documentation
</commit_message>
<xml_diff>
--- a/Програма мій помічник в дієті.docx
+++ b/Програма мій помічник в дієті.docx
@@ -3549,6 +3549,99 @@
       <w:proofErr w:type="spellEnd"/>
       <w:r>
         <w:t>. Це гарантує безшовний перехід створених користувацьких страв безпосередньо у загальну базу даних (інвентар) застосунку.</w:t>
+      </w:r>
+    </w:p>
+    <w:p>
+      <w:pPr>
+        <w:numPr>
+          <w:ilvl w:val="0"/>
+          <w:numId w:val="16"/>
+        </w:numPr>
+      </w:pPr>
+    </w:p>
+    <w:p>
+      <w:pPr>
+        <w:numPr>
+          <w:ilvl w:val="0"/>
+          <w:numId w:val="17"/>
+        </w:numPr>
+      </w:pPr>
+      <w:r>
+        <w:rPr>
+          <w:b/>
+          <w:bCs/>
+        </w:rPr>
+        <w:t>Синхронізація складу та калорій готових страв в інвентарі (10.09.2026)</w:t>
+      </w:r>
+    </w:p>
+    <w:p>
+      <w:pPr>
+        <w:numPr>
+          <w:ilvl w:val="0"/>
+          <w:numId w:val="18"/>
+        </w:numPr>
+      </w:pPr>
+      <w:r>
+        <w:t xml:space="preserve">У сервісі </w:t>
+      </w:r>
+      <w:proofErr w:type="spellStart"/>
+      <w:r>
+        <w:t>cooking_service.dart</w:t>
+      </w:r>
+      <w:proofErr w:type="spellEnd"/>
+      <w:r>
+        <w:t xml:space="preserve"> під час виконання методу </w:t>
+      </w:r>
+      <w:proofErr w:type="spellStart"/>
+      <w:r>
+        <w:t>finishCooking</w:t>
+      </w:r>
+      <w:proofErr w:type="spellEnd"/>
+      <w:r>
+        <w:t xml:space="preserve"> усунуто помилку втрати даних, через яку страви, що переносилися з кухонного котла до інвентарю, не містили інформації про свій склад. Тепер під час створення об'єкта </w:t>
+      </w:r>
+      <w:proofErr w:type="spellStart"/>
+      <w:r>
+        <w:t>PantryItemModel</w:t>
+      </w:r>
+      <w:proofErr w:type="spellEnd"/>
+      <w:r>
+        <w:t xml:space="preserve"> обов'язково передається та клонується список інгредієнтів </w:t>
+      </w:r>
+      <w:proofErr w:type="spellStart"/>
+      <w:r>
+        <w:t>ingredients</w:t>
+      </w:r>
+      <w:proofErr w:type="spellEnd"/>
+      <w:r>
+        <w:t>.</w:t>
+      </w:r>
+    </w:p>
+    <w:p>
+      <w:pPr>
+        <w:numPr>
+          <w:ilvl w:val="0"/>
+          <w:numId w:val="18"/>
+        </w:numPr>
+      </w:pPr>
+      <w:r>
+        <w:t xml:space="preserve">На екрані управління інвентарем </w:t>
+      </w:r>
+      <w:proofErr w:type="spellStart"/>
+      <w:r>
+        <w:t>inventory_screen.dart</w:t>
+      </w:r>
+      <w:proofErr w:type="spellEnd"/>
+      <w:r>
+        <w:t xml:space="preserve"> забезпечено коректний вивід попереднього перегляду складу страви за допомогою утиліти </w:t>
+      </w:r>
+      <w:proofErr w:type="spellStart"/>
+      <w:r>
+        <w:t>AppFormatters.formatIngredientsPreview</w:t>
+      </w:r>
+      <w:proofErr w:type="spellEnd"/>
+      <w:r>
+        <w:t>, а також додано відображення маси, фенілаланіну (ФА) та калорій, що повністю синхронізувало візуальне оформлення карток інвентарю з інтерфейсом екрана приготування.</w:t>
       </w:r>
     </w:p>
     <w:p/>
@@ -5209,6 +5302,146 @@
     </w:lvl>
   </w:abstractNum>
   <w:abstractNum w:abstractNumId="12" w15:restartNumberingAfterBreak="0">
+    <w:nsid w:val="586907C6"/>
+    <w:multiLevelType w:val="multilevel"/>
+    <w:tmpl w:val="240A08E6"/>
+    <w:lvl w:ilvl="0">
+      <w:start w:val="21"/>
+      <w:numFmt w:val="decimal"/>
+      <w:lvlText w:val="%1."/>
+      <w:lvlJc w:val="left"/>
+      <w:pPr>
+        <w:tabs>
+          <w:tab w:val="num" w:pos="720"/>
+        </w:tabs>
+        <w:ind w:left="720" w:hanging="360"/>
+      </w:pPr>
+      <w:rPr>
+        <w:rFonts w:hint="default"/>
+      </w:rPr>
+    </w:lvl>
+    <w:lvl w:ilvl="1">
+      <w:start w:val="1"/>
+      <w:numFmt w:val="decimal"/>
+      <w:lvlText w:val="%2."/>
+      <w:lvlJc w:val="left"/>
+      <w:pPr>
+        <w:tabs>
+          <w:tab w:val="num" w:pos="1440"/>
+        </w:tabs>
+        <w:ind w:left="1440" w:hanging="360"/>
+      </w:pPr>
+      <w:rPr>
+        <w:rFonts w:hint="default"/>
+      </w:rPr>
+    </w:lvl>
+    <w:lvl w:ilvl="2">
+      <w:start w:val="1"/>
+      <w:numFmt w:val="decimal"/>
+      <w:lvlText w:val="%3."/>
+      <w:lvlJc w:val="left"/>
+      <w:pPr>
+        <w:tabs>
+          <w:tab w:val="num" w:pos="2160"/>
+        </w:tabs>
+        <w:ind w:left="2160" w:hanging="360"/>
+      </w:pPr>
+      <w:rPr>
+        <w:rFonts w:hint="default"/>
+      </w:rPr>
+    </w:lvl>
+    <w:lvl w:ilvl="3">
+      <w:start w:val="1"/>
+      <w:numFmt w:val="decimal"/>
+      <w:lvlText w:val="%4."/>
+      <w:lvlJc w:val="left"/>
+      <w:pPr>
+        <w:tabs>
+          <w:tab w:val="num" w:pos="2880"/>
+        </w:tabs>
+        <w:ind w:left="2880" w:hanging="360"/>
+      </w:pPr>
+      <w:rPr>
+        <w:rFonts w:hint="default"/>
+      </w:rPr>
+    </w:lvl>
+    <w:lvl w:ilvl="4">
+      <w:start w:val="1"/>
+      <w:numFmt w:val="decimal"/>
+      <w:lvlText w:val="%5."/>
+      <w:lvlJc w:val="left"/>
+      <w:pPr>
+        <w:tabs>
+          <w:tab w:val="num" w:pos="3600"/>
+        </w:tabs>
+        <w:ind w:left="3600" w:hanging="360"/>
+      </w:pPr>
+      <w:rPr>
+        <w:rFonts w:hint="default"/>
+      </w:rPr>
+    </w:lvl>
+    <w:lvl w:ilvl="5">
+      <w:start w:val="1"/>
+      <w:numFmt w:val="decimal"/>
+      <w:lvlText w:val="%6."/>
+      <w:lvlJc w:val="left"/>
+      <w:pPr>
+        <w:tabs>
+          <w:tab w:val="num" w:pos="4320"/>
+        </w:tabs>
+        <w:ind w:left="4320" w:hanging="360"/>
+      </w:pPr>
+      <w:rPr>
+        <w:rFonts w:hint="default"/>
+      </w:rPr>
+    </w:lvl>
+    <w:lvl w:ilvl="6">
+      <w:start w:val="1"/>
+      <w:numFmt w:val="decimal"/>
+      <w:lvlText w:val="%7."/>
+      <w:lvlJc w:val="left"/>
+      <w:pPr>
+        <w:tabs>
+          <w:tab w:val="num" w:pos="5040"/>
+        </w:tabs>
+        <w:ind w:left="5040" w:hanging="360"/>
+      </w:pPr>
+      <w:rPr>
+        <w:rFonts w:hint="default"/>
+      </w:rPr>
+    </w:lvl>
+    <w:lvl w:ilvl="7">
+      <w:start w:val="1"/>
+      <w:numFmt w:val="decimal"/>
+      <w:lvlText w:val="%8."/>
+      <w:lvlJc w:val="left"/>
+      <w:pPr>
+        <w:tabs>
+          <w:tab w:val="num" w:pos="5760"/>
+        </w:tabs>
+        <w:ind w:left="5760" w:hanging="360"/>
+      </w:pPr>
+      <w:rPr>
+        <w:rFonts w:hint="default"/>
+      </w:rPr>
+    </w:lvl>
+    <w:lvl w:ilvl="8">
+      <w:start w:val="1"/>
+      <w:numFmt w:val="decimal"/>
+      <w:lvlText w:val="%9."/>
+      <w:lvlJc w:val="left"/>
+      <w:pPr>
+        <w:tabs>
+          <w:tab w:val="num" w:pos="6480"/>
+        </w:tabs>
+        <w:ind w:left="6480" w:hanging="360"/>
+      </w:pPr>
+      <w:rPr>
+        <w:rFonts w:hint="default"/>
+      </w:rPr>
+    </w:lvl>
+  </w:abstractNum>
+  <w:abstractNum w:abstractNumId="13" w15:restartNumberingAfterBreak="0">
     <w:nsid w:val="62954BBD"/>
     <w:multiLevelType w:val="multilevel"/>
     <w:tmpl w:val="B99AEF6E"/>
@@ -5357,7 +5590,7 @@
       </w:rPr>
     </w:lvl>
   </w:abstractNum>
-  <w:abstractNum w:abstractNumId="13" w15:restartNumberingAfterBreak="0">
+  <w:abstractNum w:abstractNumId="14" w15:restartNumberingAfterBreak="0">
     <w:nsid w:val="6E4C3B16"/>
     <w:multiLevelType w:val="multilevel"/>
     <w:tmpl w:val="0B2AB0B0"/>
@@ -5470,7 +5703,7 @@
       </w:pPr>
     </w:lvl>
   </w:abstractNum>
-  <w:abstractNum w:abstractNumId="14" w15:restartNumberingAfterBreak="0">
+  <w:abstractNum w:abstractNumId="15" w15:restartNumberingAfterBreak="0">
     <w:nsid w:val="75F057CE"/>
     <w:multiLevelType w:val="multilevel"/>
     <w:tmpl w:val="AA1A3070"/>
@@ -5619,7 +5852,7 @@
       </w:rPr>
     </w:lvl>
   </w:abstractNum>
-  <w:abstractNum w:abstractNumId="15" w15:restartNumberingAfterBreak="0">
+  <w:abstractNum w:abstractNumId="16" w15:restartNumberingAfterBreak="0">
     <w:nsid w:val="76097671"/>
     <w:multiLevelType w:val="multilevel"/>
     <w:tmpl w:val="40545E18"/>
@@ -5656,6 +5889,155 @@
       </w:rPr>
     </w:lvl>
     <w:lvl w:ilvl="2">
+      <w:start w:val="1"/>
+      <w:numFmt w:val="bullet"/>
+      <w:lvlText w:val=""/>
+      <w:lvlJc w:val="left"/>
+      <w:pPr>
+        <w:tabs>
+          <w:tab w:val="num" w:pos="2160"/>
+        </w:tabs>
+        <w:ind w:left="2160" w:hanging="360"/>
+      </w:pPr>
+      <w:rPr>
+        <w:rFonts w:ascii="Wingdings" w:hAnsi="Wingdings" w:hint="default"/>
+        <w:sz w:val="20"/>
+      </w:rPr>
+    </w:lvl>
+    <w:lvl w:ilvl="3" w:tentative="1">
+      <w:start w:val="1"/>
+      <w:numFmt w:val="bullet"/>
+      <w:lvlText w:val=""/>
+      <w:lvlJc w:val="left"/>
+      <w:pPr>
+        <w:tabs>
+          <w:tab w:val="num" w:pos="2880"/>
+        </w:tabs>
+        <w:ind w:left="2880" w:hanging="360"/>
+      </w:pPr>
+      <w:rPr>
+        <w:rFonts w:ascii="Wingdings" w:hAnsi="Wingdings" w:hint="default"/>
+        <w:sz w:val="20"/>
+      </w:rPr>
+    </w:lvl>
+    <w:lvl w:ilvl="4" w:tentative="1">
+      <w:start w:val="1"/>
+      <w:numFmt w:val="bullet"/>
+      <w:lvlText w:val=""/>
+      <w:lvlJc w:val="left"/>
+      <w:pPr>
+        <w:tabs>
+          <w:tab w:val="num" w:pos="3600"/>
+        </w:tabs>
+        <w:ind w:left="3600" w:hanging="360"/>
+      </w:pPr>
+      <w:rPr>
+        <w:rFonts w:ascii="Wingdings" w:hAnsi="Wingdings" w:hint="default"/>
+        <w:sz w:val="20"/>
+      </w:rPr>
+    </w:lvl>
+    <w:lvl w:ilvl="5" w:tentative="1">
+      <w:start w:val="1"/>
+      <w:numFmt w:val="bullet"/>
+      <w:lvlText w:val=""/>
+      <w:lvlJc w:val="left"/>
+      <w:pPr>
+        <w:tabs>
+          <w:tab w:val="num" w:pos="4320"/>
+        </w:tabs>
+        <w:ind w:left="4320" w:hanging="360"/>
+      </w:pPr>
+      <w:rPr>
+        <w:rFonts w:ascii="Wingdings" w:hAnsi="Wingdings" w:hint="default"/>
+        <w:sz w:val="20"/>
+      </w:rPr>
+    </w:lvl>
+    <w:lvl w:ilvl="6" w:tentative="1">
+      <w:start w:val="1"/>
+      <w:numFmt w:val="bullet"/>
+      <w:lvlText w:val=""/>
+      <w:lvlJc w:val="left"/>
+      <w:pPr>
+        <w:tabs>
+          <w:tab w:val="num" w:pos="5040"/>
+        </w:tabs>
+        <w:ind w:left="5040" w:hanging="360"/>
+      </w:pPr>
+      <w:rPr>
+        <w:rFonts w:ascii="Wingdings" w:hAnsi="Wingdings" w:hint="default"/>
+        <w:sz w:val="20"/>
+      </w:rPr>
+    </w:lvl>
+    <w:lvl w:ilvl="7" w:tentative="1">
+      <w:start w:val="1"/>
+      <w:numFmt w:val="bullet"/>
+      <w:lvlText w:val=""/>
+      <w:lvlJc w:val="left"/>
+      <w:pPr>
+        <w:tabs>
+          <w:tab w:val="num" w:pos="5760"/>
+        </w:tabs>
+        <w:ind w:left="5760" w:hanging="360"/>
+      </w:pPr>
+      <w:rPr>
+        <w:rFonts w:ascii="Wingdings" w:hAnsi="Wingdings" w:hint="default"/>
+        <w:sz w:val="20"/>
+      </w:rPr>
+    </w:lvl>
+    <w:lvl w:ilvl="8" w:tentative="1">
+      <w:start w:val="1"/>
+      <w:numFmt w:val="bullet"/>
+      <w:lvlText w:val=""/>
+      <w:lvlJc w:val="left"/>
+      <w:pPr>
+        <w:tabs>
+          <w:tab w:val="num" w:pos="6480"/>
+        </w:tabs>
+        <w:ind w:left="6480" w:hanging="360"/>
+      </w:pPr>
+      <w:rPr>
+        <w:rFonts w:ascii="Wingdings" w:hAnsi="Wingdings" w:hint="default"/>
+        <w:sz w:val="20"/>
+      </w:rPr>
+    </w:lvl>
+  </w:abstractNum>
+  <w:abstractNum w:abstractNumId="17" w15:restartNumberingAfterBreak="0">
+    <w:nsid w:val="783148F7"/>
+    <w:multiLevelType w:val="multilevel"/>
+    <w:tmpl w:val="EE6C3BCC"/>
+    <w:lvl w:ilvl="0">
+      <w:start w:val="1"/>
+      <w:numFmt w:val="bullet"/>
+      <w:lvlText w:val=""/>
+      <w:lvlJc w:val="left"/>
+      <w:pPr>
+        <w:tabs>
+          <w:tab w:val="num" w:pos="720"/>
+        </w:tabs>
+        <w:ind w:left="720" w:hanging="360"/>
+      </w:pPr>
+      <w:rPr>
+        <w:rFonts w:ascii="Symbol" w:hAnsi="Symbol" w:hint="default"/>
+        <w:sz w:val="20"/>
+      </w:rPr>
+    </w:lvl>
+    <w:lvl w:ilvl="1" w:tentative="1">
+      <w:start w:val="1"/>
+      <w:numFmt w:val="bullet"/>
+      <w:lvlText w:val="o"/>
+      <w:lvlJc w:val="left"/>
+      <w:pPr>
+        <w:tabs>
+          <w:tab w:val="num" w:pos="1440"/>
+        </w:tabs>
+        <w:ind w:left="1440" w:hanging="360"/>
+      </w:pPr>
+      <w:rPr>
+        <w:rFonts w:ascii="Courier New" w:hAnsi="Courier New" w:hint="default"/>
+        <w:sz w:val="20"/>
+      </w:rPr>
+    </w:lvl>
+    <w:lvl w:ilvl="2" w:tentative="1">
       <w:start w:val="1"/>
       <w:numFmt w:val="bullet"/>
       <w:lvlText w:val=""/>
@@ -5781,13 +6163,13 @@
     <w:abstractNumId w:val="1"/>
   </w:num>
   <w:num w:numId="5" w16cid:durableId="1443573979">
-    <w:abstractNumId w:val="14"/>
+    <w:abstractNumId w:val="15"/>
   </w:num>
   <w:num w:numId="6" w16cid:durableId="1925414819">
     <w:abstractNumId w:val="2"/>
   </w:num>
   <w:num w:numId="7" w16cid:durableId="579022772">
-    <w:abstractNumId w:val="15"/>
+    <w:abstractNumId w:val="16"/>
   </w:num>
   <w:num w:numId="8" w16cid:durableId="1287353506">
     <w:abstractNumId w:val="5"/>
@@ -5805,16 +6187,22 @@
     <w:abstractNumId w:val="7"/>
   </w:num>
   <w:num w:numId="13" w16cid:durableId="1908607228">
-    <w:abstractNumId w:val="12"/>
+    <w:abstractNumId w:val="13"/>
   </w:num>
   <w:num w:numId="14" w16cid:durableId="439379675">
     <w:abstractNumId w:val="3"/>
   </w:num>
   <w:num w:numId="15" w16cid:durableId="1872569358">
-    <w:abstractNumId w:val="13"/>
+    <w:abstractNumId w:val="14"/>
   </w:num>
   <w:num w:numId="16" w16cid:durableId="687373648">
     <w:abstractNumId w:val="11"/>
+  </w:num>
+  <w:num w:numId="17" w16cid:durableId="235477186">
+    <w:abstractNumId w:val="12"/>
+  </w:num>
+  <w:num w:numId="18" w16cid:durableId="819031317">
+    <w:abstractNumId w:val="17"/>
   </w:num>
   <w:numIdMacAtCleanup w:val="7"/>
 </w:numbering>

</xml_diff>

<commit_message>
feat: auto-generate default meals on empty date and update project notes
</commit_message>
<xml_diff>
--- a/Програма мій помічник в дієті.docx
+++ b/Програма мій помічник в дієті.docx
@@ -3642,6 +3642,33 @@
       <w:proofErr w:type="spellEnd"/>
       <w:r>
         <w:t>, а також додано відображення маси, фенілаланіну (ФА) та калорій, що повністю синхронізувало візуальне оформлення карток інвентарю з інтерфейсом екрана приготування.</w:t>
+      </w:r>
+    </w:p>
+    <w:p>
+      <w:pPr>
+        <w:pStyle w:val="a9"/>
+        <w:numPr>
+          <w:ilvl w:val="0"/>
+          <w:numId w:val="17"/>
+        </w:numPr>
+      </w:pPr>
+      <w:r>
+        <w:rPr>
+          <w:b/>
+          <w:bCs/>
+        </w:rPr>
+        <w:t>Автоматична генерація базового каркаса прийомів їжі для обраної дати (11.09.2026)</w:t>
+      </w:r>
+      <w:r>
+        <w:t xml:space="preserve"> Допрацьовано логіку збереження та відображення раціону в репозиторії </w:t>
+      </w:r>
+      <w:proofErr w:type="spellStart"/>
+      <w:r>
+        <w:t>DietRepository</w:t>
+      </w:r>
+      <w:proofErr w:type="spellEnd"/>
+      <w:r>
+        <w:t>. Реалізовано перевірку наявності записів за обрану дату в локальній базі даних. Якщо записи відсутні або список є порожнім, система автоматично створює та зберігає три основні прийоми їжі: «СНІДАНОК», «ОБІД» та «ВЕЧЕРЯ». Це забезпечує зручний та передбачуваний інтерфейс для користувача при переході на будь-який день (минулий, поточний чи майбутній), дозволяючи одразу додавати продукти без необхідності вручну створювати базові блоки, при цьому повністю зберігаючи можливість додавання кастомних прийомів їжі.</w:t>
       </w:r>
     </w:p>
     <w:p/>

</xml_diff>